<commit_message>
Day 11: deepen Materi to the plan's Wissen (rule 2.17) with real findings
All 10 Wissen topics are now full: word error rate in a test and across speakers, hands-free
distraction, WCAG 2.5.3, the discoverability and feedback heuristics, Wizard of Oz, what a prototype
is for, and EU AI Act Article 50. Day 11 added to verify:depth; Word documents of Day 11 rebuilt.

Co-Authored-By: Claude Sonnet 5.5 <noreply@anthropic.com>
</commit_message>
<xml_diff>
--- a/docx/Day11-Materi-AION-UX-Developer-Voice-interfaces-neuro-design-and-testing-AI-interfaces.docx
+++ b/docx/Day11-Materi-AION-UX-Developer-Voice-interfaces-neuro-design-and-testing-AI-interfaces.docx
@@ -2929,6 +2929,319 @@
         <w:spacing w:before="0" w:after="80"/>
       </w:pPr>
     </w:p>
+    <w:p>
+      <w:pPr>
+        <w:spacing w:before="0" w:after="100"/>
+      </w:pPr>
+      <w:r>
+        <w:rPr>
+          <w:b/>
+        </w:rPr>
+        <w:t>What voice can do and where it fails: evidence</w:t>
+      </w:r>
+    </w:p>
+    <w:tbl>
+      <w:tblPr>
+        <w:tblW w:w="9638" w:type="dxa"/>
+        <w:tblBorders>
+          <w:top w:val="single" w:sz="4" w:space="0" w:color="D5DEE9"/>
+          <w:left w:val="single" w:sz="4" w:space="0" w:color="D5DEE9"/>
+          <w:bottom w:val="single" w:sz="4" w:space="0" w:color="D5DEE9"/>
+          <w:right w:val="single" w:sz="4" w:space="0" w:color="D5DEE9"/>
+          <w:insideH w:val="single" w:sz="4" w:space="0" w:color="D5DEE9"/>
+          <w:insideV w:val="single" w:sz="4" w:space="0" w:color="D5DEE9"/>
+        </w:tblBorders>
+        <w:tblLayout w:type="fixed"/>
+        <w:tblCellMar>
+          <w:top w:w="60" w:type="dxa"/>
+          <w:left w:w="100" w:type="dxa"/>
+          <w:bottom w:w="60" w:type="dxa"/>
+          <w:right w:w="100" w:type="dxa"/>
+        </w:tblCellMar>
+      </w:tblPr>
+      <w:tblGrid>
+        <w:gridCol w:w="1949"/>
+        <w:gridCol w:w="4691"/>
+        <w:gridCol w:w="2998"/>
+      </w:tblGrid>
+      <w:tr>
+        <w:trPr>
+          <w:cantSplit/>
+          <w:tblHeader/>
+        </w:trPr>
+        <w:tc>
+          <w:tcPr>
+            <w:tcW w:type="dxa" w:w="1949"/>
+            <w:shd w:val="clear" w:color="auto" w:fill="E6ECF4"/>
+          </w:tcPr>
+          <w:p>
+            <w:pPr>
+              <w:spacing w:before="0" w:after="0"/>
+            </w:pPr>
+            <w:r>
+              <w:rPr>
+                <w:b/>
+                <w:sz w:val="20"/>
+              </w:rPr>
+              <w:t>Topic</w:t>
+            </w:r>
+          </w:p>
+        </w:tc>
+        <w:tc>
+          <w:tcPr>
+            <w:tcW w:type="dxa" w:w="4691"/>
+            <w:shd w:val="clear" w:color="auto" w:fill="E6ECF4"/>
+          </w:tcPr>
+          <w:p>
+            <w:pPr>
+              <w:spacing w:before="0" w:after="0"/>
+            </w:pPr>
+            <w:r>
+              <w:rPr>
+                <w:b/>
+                <w:sz w:val="20"/>
+              </w:rPr>
+              <w:t>Real finding or rule</w:t>
+            </w:r>
+          </w:p>
+        </w:tc>
+        <w:tc>
+          <w:tcPr>
+            <w:tcW w:type="dxa" w:w="2998"/>
+            <w:shd w:val="clear" w:color="auto" w:fill="E6ECF4"/>
+          </w:tcPr>
+          <w:p>
+            <w:pPr>
+              <w:spacing w:before="0" w:after="0"/>
+            </w:pPr>
+            <w:r>
+              <w:rPr>
+                <w:b/>
+                <w:sz w:val="20"/>
+              </w:rPr>
+              <w:t>What it means for a screen</w:t>
+            </w:r>
+          </w:p>
+        </w:tc>
+      </w:tr>
+      <w:tr>
+        <w:trPr>
+          <w:cantSplit/>
+        </w:trPr>
+        <w:tc>
+          <w:tcPr>
+            <w:tcW w:type="dxa" w:w="1949"/>
+          </w:tcPr>
+          <w:p>
+            <w:pPr>
+              <w:spacing w:before="0" w:after="0"/>
+            </w:pPr>
+            <w:r>
+              <w:rPr>
+                <w:sz w:val="20"/>
+              </w:rPr>
+              <w:t>Accuracy in a test</w:t>
+            </w:r>
+          </w:p>
+        </w:tc>
+        <w:tc>
+          <w:tcPr>
+            <w:tcW w:type="dxa" w:w="4691"/>
+          </w:tcPr>
+          <w:p>
+            <w:pPr>
+              <w:spacing w:before="0" w:after="0"/>
+            </w:pPr>
+            <w:r>
+              <w:rPr>
+                <w:sz w:val="20"/>
+              </w:rPr>
+              <w:t>A research system reached a word error rate of 5.1% on a standard test of telephone conversations, which the authors report as matching the human transcription error of the careful benchmark (Xiong et al. 2017).</w:t>
+            </w:r>
+          </w:p>
+        </w:tc>
+        <w:tc>
+          <w:tcPr>
+            <w:tcW w:type="dxa" w:w="2998"/>
+          </w:tcPr>
+          <w:p>
+            <w:pPr>
+              <w:spacing w:before="0" w:after="0"/>
+            </w:pPr>
+            <w:r>
+              <w:rPr>
+                <w:sz w:val="20"/>
+              </w:rPr>
+              <w:t>Recognition can be very good under test conditions; the test is not your users' kitchen.</w:t>
+            </w:r>
+          </w:p>
+        </w:tc>
+      </w:tr>
+      <w:tr>
+        <w:trPr>
+          <w:cantSplit/>
+        </w:trPr>
+        <w:tc>
+          <w:tcPr>
+            <w:tcW w:type="dxa" w:w="1949"/>
+          </w:tcPr>
+          <w:p>
+            <w:pPr>
+              <w:spacing w:before="0" w:after="0"/>
+            </w:pPr>
+            <w:r>
+              <w:rPr>
+                <w:sz w:val="20"/>
+              </w:rPr>
+              <w:t>Accuracy for whom</w:t>
+            </w:r>
+          </w:p>
+        </w:tc>
+        <w:tc>
+          <w:tcPr>
+            <w:tcW w:type="dxa" w:w="4691"/>
+          </w:tcPr>
+          <w:p>
+            <w:pPr>
+              <w:spacing w:before="0" w:after="0"/>
+            </w:pPr>
+            <w:r>
+              <w:rPr>
+                <w:sz w:val="20"/>
+              </w:rPr>
+              <w:t>In a study of five commercial speech recognition systems, the average word error rate was 0.35 for Black speakers and 0.19 for white speakers (Koenecke et al. 2020).</w:t>
+            </w:r>
+          </w:p>
+        </w:tc>
+        <w:tc>
+          <w:tcPr>
+            <w:tcW w:type="dxa" w:w="2998"/>
+          </w:tcPr>
+          <w:p>
+            <w:pPr>
+              <w:spacing w:before="0" w:after="0"/>
+            </w:pPr>
+            <w:r>
+              <w:rPr>
+                <w:sz w:val="20"/>
+              </w:rPr>
+              <w:t>Test with the full range of your users' voices, or the error-proneness lands on some of them.</w:t>
+            </w:r>
+          </w:p>
+        </w:tc>
+      </w:tr>
+      <w:tr>
+        <w:trPr>
+          <w:cantSplit/>
+        </w:trPr>
+        <w:tc>
+          <w:tcPr>
+            <w:tcW w:type="dxa" w:w="1949"/>
+          </w:tcPr>
+          <w:p>
+            <w:pPr>
+              <w:spacing w:before="0" w:after="0"/>
+            </w:pPr>
+            <w:r>
+              <w:rPr>
+                <w:sz w:val="20"/>
+              </w:rPr>
+              <w:t>Hands-free is not risk-free</w:t>
+            </w:r>
+          </w:p>
+        </w:tc>
+        <w:tc>
+          <w:tcPr>
+            <w:tcW w:type="dxa" w:w="4691"/>
+          </w:tcPr>
+          <w:p>
+            <w:pPr>
+              <w:spacing w:before="0" w:after="0"/>
+            </w:pPr>
+            <w:r>
+              <w:rPr>
+                <w:sz w:val="20"/>
+              </w:rPr>
+              <w:t>In a study of the infotainment systems of ten cars, mental distraction after a task lasted up to 27 seconds for the worst-performing systems, and practice did not remove it (Strayer et al. 2015, as reported).</w:t>
+            </w:r>
+          </w:p>
+        </w:tc>
+        <w:tc>
+          <w:tcPr>
+            <w:tcW w:type="dxa" w:w="2998"/>
+          </w:tcPr>
+          <w:p>
+            <w:pPr>
+              <w:spacing w:before="0" w:after="0"/>
+            </w:pPr>
+            <w:r>
+              <w:rPr>
+                <w:sz w:val="20"/>
+              </w:rPr>
+              <w:t>Voice in a driving or cooking context still takes attention: keep dialogues short.</w:t>
+            </w:r>
+          </w:p>
+        </w:tc>
+      </w:tr>
+      <w:tr>
+        <w:trPr>
+          <w:cantSplit/>
+        </w:trPr>
+        <w:tc>
+          <w:tcPr>
+            <w:tcW w:type="dxa" w:w="1949"/>
+          </w:tcPr>
+          <w:p>
+            <w:pPr>
+              <w:spacing w:before="0" w:after="0"/>
+            </w:pPr>
+            <w:r>
+              <w:rPr>
+                <w:sz w:val="20"/>
+              </w:rPr>
+              <w:t>Voice and accessibility</w:t>
+            </w:r>
+          </w:p>
+        </w:tc>
+        <w:tc>
+          <w:tcPr>
+            <w:tcW w:type="dxa" w:w="4691"/>
+          </w:tcPr>
+          <w:p>
+            <w:pPr>
+              <w:spacing w:before="0" w:after="0"/>
+            </w:pPr>
+            <w:r>
+              <w:rPr>
+                <w:sz w:val="20"/>
+              </w:rPr>
+              <w:t>WCAG 2.2 asks that the accessible name of a control contains its visible label (success criterion 2.5.3), so that people who control a screen by voice can say what they see.</w:t>
+            </w:r>
+          </w:p>
+        </w:tc>
+        <w:tc>
+          <w:tcPr>
+            <w:tcW w:type="dxa" w:w="2998"/>
+          </w:tcPr>
+          <w:p>
+            <w:pPr>
+              <w:spacing w:before="0" w:after="0"/>
+            </w:pPr>
+            <w:r>
+              <w:rPr>
+                <w:sz w:val="20"/>
+              </w:rPr>
+              <w:t>Name the controls the way they are written on screen.</w:t>
+            </w:r>
+          </w:p>
+        </w:tc>
+      </w:tr>
+    </w:tbl>
+    <w:p>
+      <w:pPr>
+        <w:spacing w:before="0" w:after="80"/>
+      </w:pPr>
+    </w:p>
     <w:tbl>
       <w:tblPr>
         <w:tblW w:w="9598" w:type="dxa"/>
@@ -2978,7 +3291,7 @@
             </w:pPr>
             <w:r>
               <w:rPr/>
-              <w:t>Ladle, Noor, Ole, Freya and Piet are made up for this example. Dialogue logic and the strengths and limits of spoken interfaces follow Cohen et al. (2004) and Pearl (2016).</w:t>
+              <w:t>Ladle, Noor, Ole, Freya and Piet are made up for this example. Dialogue logic and the strengths and limits of spoken interfaces follow Cohen et al. (2004) and Pearl (2016). The findings in the table of real evidence are real research results, rules and cases; the sources are listed below.</w:t>
             </w:r>
           </w:p>
         </w:tc>
@@ -3167,7 +3480,7 @@
           <w:color w:val="556274"/>
           <w:sz w:val="18"/>
         </w:rPr>
-        <w:t>Cohen et al. 2004 · Pearl 2016</w:t>
+        <w:t>Cohen et al. 2004 · Pearl 2016 · Xiong et al. 2017 · Koenecke et al. 2020 · Strayer et al. 2015 · WCAG 2.2</w:t>
       </w:r>
     </w:p>
     <w:p>
@@ -3766,6 +4079,372 @@
         <w:spacing w:before="0" w:after="80"/>
       </w:pPr>
     </w:p>
+    <w:p>
+      <w:pPr>
+        <w:spacing w:before="0" w:after="100"/>
+      </w:pPr>
+      <w:r>
+        <w:rPr>
+          <w:b/>
+        </w:rPr>
+        <w:t>A good voice dialogue: principles with sources</w:t>
+      </w:r>
+    </w:p>
+    <w:tbl>
+      <w:tblPr>
+        <w:tblW w:w="9638" w:type="dxa"/>
+        <w:tblBorders>
+          <w:top w:val="single" w:sz="4" w:space="0" w:color="D5DEE9"/>
+          <w:left w:val="single" w:sz="4" w:space="0" w:color="D5DEE9"/>
+          <w:bottom w:val="single" w:sz="4" w:space="0" w:color="D5DEE9"/>
+          <w:right w:val="single" w:sz="4" w:space="0" w:color="D5DEE9"/>
+          <w:insideH w:val="single" w:sz="4" w:space="0" w:color="D5DEE9"/>
+          <w:insideV w:val="single" w:sz="4" w:space="0" w:color="D5DEE9"/>
+        </w:tblBorders>
+        <w:tblLayout w:type="fixed"/>
+        <w:tblCellMar>
+          <w:top w:w="60" w:type="dxa"/>
+          <w:left w:w="100" w:type="dxa"/>
+          <w:bottom w:w="60" w:type="dxa"/>
+          <w:right w:w="100" w:type="dxa"/>
+        </w:tblCellMar>
+      </w:tblPr>
+      <w:tblGrid>
+        <w:gridCol w:w="1930"/>
+        <w:gridCol w:w="4723"/>
+        <w:gridCol w:w="2985"/>
+      </w:tblGrid>
+      <w:tr>
+        <w:trPr>
+          <w:cantSplit/>
+          <w:tblHeader/>
+        </w:trPr>
+        <w:tc>
+          <w:tcPr>
+            <w:tcW w:type="dxa" w:w="1930"/>
+            <w:shd w:val="clear" w:color="auto" w:fill="E6ECF4"/>
+          </w:tcPr>
+          <w:p>
+            <w:pPr>
+              <w:spacing w:before="0" w:after="0"/>
+            </w:pPr>
+            <w:r>
+              <w:rPr>
+                <w:b/>
+                <w:sz w:val="20"/>
+              </w:rPr>
+              <w:t>Requirement</w:t>
+            </w:r>
+          </w:p>
+        </w:tc>
+        <w:tc>
+          <w:tcPr>
+            <w:tcW w:type="dxa" w:w="4723"/>
+            <w:shd w:val="clear" w:color="auto" w:fill="E6ECF4"/>
+          </w:tcPr>
+          <w:p>
+            <w:pPr>
+              <w:spacing w:before="0" w:after="0"/>
+            </w:pPr>
+            <w:r>
+              <w:rPr>
+                <w:b/>
+                <w:sz w:val="20"/>
+              </w:rPr>
+              <w:t>Real principle</w:t>
+            </w:r>
+          </w:p>
+        </w:tc>
+        <w:tc>
+          <w:tcPr>
+            <w:tcW w:type="dxa" w:w="2985"/>
+            <w:shd w:val="clear" w:color="auto" w:fill="E6ECF4"/>
+          </w:tcPr>
+          <w:p>
+            <w:pPr>
+              <w:spacing w:before="0" w:after="0"/>
+            </w:pPr>
+            <w:r>
+              <w:rPr>
+                <w:b/>
+                <w:sz w:val="20"/>
+              </w:rPr>
+              <w:t>What it means for a dialogue</w:t>
+            </w:r>
+          </w:p>
+        </w:tc>
+      </w:tr>
+      <w:tr>
+        <w:trPr>
+          <w:cantSplit/>
+        </w:trPr>
+        <w:tc>
+          <w:tcPr>
+            <w:tcW w:type="dxa" w:w="1930"/>
+          </w:tcPr>
+          <w:p>
+            <w:pPr>
+              <w:spacing w:before="0" w:after="0"/>
+            </w:pPr>
+            <w:r>
+              <w:rPr>
+                <w:sz w:val="20"/>
+              </w:rPr>
+              <w:t>Clear expectations</w:t>
+            </w:r>
+          </w:p>
+        </w:tc>
+        <w:tc>
+          <w:tcPr>
+            <w:tcW w:type="dxa" w:w="4723"/>
+          </w:tcPr>
+          <w:p>
+            <w:pPr>
+              <w:spacing w:before="0" w:after="0"/>
+            </w:pPr>
+            <w:r>
+              <w:rPr>
+                <w:sz w:val="20"/>
+              </w:rPr>
+              <w:t>Norman calls the quality that makes the available actions visible discoverability (Norman 2013); with voice, nothing is visible unless the system says it.</w:t>
+            </w:r>
+          </w:p>
+        </w:tc>
+        <w:tc>
+          <w:tcPr>
+            <w:tcW w:type="dxa" w:w="2985"/>
+          </w:tcPr>
+          <w:p>
+            <w:pPr>
+              <w:spacing w:before="0" w:after="0"/>
+            </w:pPr>
+            <w:r>
+              <w:rPr>
+                <w:sz w:val="20"/>
+              </w:rPr>
+              <w:t>Say what can be said, at the moment it matters: “You can say next, repeat, timer, stop.”</w:t>
+            </w:r>
+          </w:p>
+        </w:tc>
+      </w:tr>
+      <w:tr>
+        <w:trPr>
+          <w:cantSplit/>
+        </w:trPr>
+        <w:tc>
+          <w:tcPr>
+            <w:tcW w:type="dxa" w:w="1930"/>
+          </w:tcPr>
+          <w:p>
+            <w:pPr>
+              <w:spacing w:before="0" w:after="0"/>
+            </w:pPr>
+            <w:r>
+              <w:rPr>
+                <w:sz w:val="20"/>
+              </w:rPr>
+              <w:t>Feedback</w:t>
+            </w:r>
+          </w:p>
+        </w:tc>
+        <w:tc>
+          <w:tcPr>
+            <w:tcW w:type="dxa" w:w="4723"/>
+          </w:tcPr>
+          <w:p>
+            <w:pPr>
+              <w:spacing w:before="0" w:after="0"/>
+            </w:pPr>
+            <w:r>
+              <w:rPr>
+                <w:sz w:val="20"/>
+              </w:rPr>
+              <w:t>One of the ten heuristics asks the system to keep users informed about what is going on, through appropriate feedback within a reasonable time (Nielsen 1994).</w:t>
+            </w:r>
+          </w:p>
+        </w:tc>
+        <w:tc>
+          <w:tcPr>
+            <w:tcW w:type="dxa" w:w="2985"/>
+          </w:tcPr>
+          <w:p>
+            <w:pPr>
+              <w:spacing w:before="0" w:after="0"/>
+            </w:pPr>
+            <w:r>
+              <w:rPr>
+                <w:sz w:val="20"/>
+              </w:rPr>
+              <w:t>Repeat back what was understood: “Timer for 5 minutes, for the nuts, started.”</w:t>
+            </w:r>
+          </w:p>
+        </w:tc>
+      </w:tr>
+      <w:tr>
+        <w:trPr>
+          <w:cantSplit/>
+        </w:trPr>
+        <w:tc>
+          <w:tcPr>
+            <w:tcW w:type="dxa" w:w="1930"/>
+          </w:tcPr>
+          <w:p>
+            <w:pPr>
+              <w:spacing w:before="0" w:after="0"/>
+            </w:pPr>
+            <w:r>
+              <w:rPr>
+                <w:sz w:val="20"/>
+              </w:rPr>
+              <w:t>Error handling</w:t>
+            </w:r>
+          </w:p>
+        </w:tc>
+        <w:tc>
+          <w:tcPr>
+            <w:tcW w:type="dxa" w:w="4723"/>
+          </w:tcPr>
+          <w:p>
+            <w:pPr>
+              <w:spacing w:before="0" w:after="0"/>
+            </w:pPr>
+            <w:r>
+              <w:rPr>
+                <w:sz w:val="20"/>
+              </w:rPr>
+              <w:t>Another heuristic asks that error messages are expressed in plain language, indicate the problem and suggest a solution (Nielsen 1994).</w:t>
+            </w:r>
+          </w:p>
+        </w:tc>
+        <w:tc>
+          <w:tcPr>
+            <w:tcW w:type="dxa" w:w="2985"/>
+          </w:tcPr>
+          <w:p>
+            <w:pPr>
+              <w:spacing w:before="0" w:after="0"/>
+            </w:pPr>
+            <w:r>
+              <w:rPr>
+                <w:sz w:val="20"/>
+              </w:rPr>
+              <w:t>Ask a narrow question after a failure, and offer the screen as a way out.</w:t>
+            </w:r>
+          </w:p>
+        </w:tc>
+      </w:tr>
+      <w:tr>
+        <w:trPr>
+          <w:cantSplit/>
+        </w:trPr>
+        <w:tc>
+          <w:tcPr>
+            <w:tcW w:type="dxa" w:w="1930"/>
+          </w:tcPr>
+          <w:p>
+            <w:pPr>
+              <w:spacing w:before="0" w:after="0"/>
+            </w:pPr>
+            <w:r>
+              <w:rPr>
+                <w:sz w:val="20"/>
+              </w:rPr>
+              <w:t>Repeatability</w:t>
+            </w:r>
+          </w:p>
+        </w:tc>
+        <w:tc>
+          <w:tcPr>
+            <w:tcW w:type="dxa" w:w="4723"/>
+          </w:tcPr>
+          <w:p>
+            <w:pPr>
+              <w:spacing w:before="0" w:after="0"/>
+            </w:pPr>
+            <w:r>
+              <w:rPr>
+                <w:sz w:val="20"/>
+              </w:rPr>
+              <w:t>Speech passes by and cannot be re-read; working memory holds about four chunks (Cowan 2001).</w:t>
+            </w:r>
+          </w:p>
+        </w:tc>
+        <w:tc>
+          <w:tcPr>
+            <w:tcW w:type="dxa" w:w="2985"/>
+          </w:tcPr>
+          <w:p>
+            <w:pPr>
+              <w:spacing w:before="0" w:after="0"/>
+            </w:pPr>
+            <w:r>
+              <w:rPr>
+                <w:sz w:val="20"/>
+              </w:rPr>
+              <w:t>Let people say “repeat”, and keep each answer to a few chunks.</w:t>
+            </w:r>
+          </w:p>
+        </w:tc>
+      </w:tr>
+      <w:tr>
+        <w:trPr>
+          <w:cantSplit/>
+        </w:trPr>
+        <w:tc>
+          <w:tcPr>
+            <w:tcW w:type="dxa" w:w="1930"/>
+          </w:tcPr>
+          <w:p>
+            <w:pPr>
+              <w:spacing w:before="0" w:after="0"/>
+            </w:pPr>
+            <w:r>
+              <w:rPr>
+                <w:sz w:val="20"/>
+              </w:rPr>
+              <w:t>Design practice</w:t>
+            </w:r>
+          </w:p>
+        </w:tc>
+        <w:tc>
+          <w:tcPr>
+            <w:tcW w:type="dxa" w:w="4723"/>
+          </w:tcPr>
+          <w:p>
+            <w:pPr>
+              <w:spacing w:before="0" w:after="0"/>
+            </w:pPr>
+            <w:r>
+              <w:rPr>
+                <w:sz w:val="20"/>
+              </w:rPr>
+              <w:t>Voice interface design books describe the same elements: dialogue logic, prompts, confirmation and recovery (Cohen et al. 2004; Pearl 2016).</w:t>
+            </w:r>
+          </w:p>
+        </w:tc>
+        <w:tc>
+          <w:tcPr>
+            <w:tcW w:type="dxa" w:w="2985"/>
+          </w:tcPr>
+          <w:p>
+            <w:pPr>
+              <w:spacing w:before="0" w:after="0"/>
+            </w:pPr>
+            <w:r>
+              <w:rPr>
+                <w:sz w:val="20"/>
+              </w:rPr>
+              <w:t>Write the dialogue as a script and read it aloud before building it.</w:t>
+            </w:r>
+          </w:p>
+        </w:tc>
+      </w:tr>
+    </w:tbl>
+    <w:p>
+      <w:pPr>
+        <w:spacing w:before="0" w:after="80"/>
+      </w:pPr>
+    </w:p>
     <w:tbl>
       <w:tblPr>
         <w:tblW w:w="9598" w:type="dxa"/>
@@ -3815,7 +4494,7 @@
             </w:pPr>
             <w:r>
               <w:rPr/>
-              <w:t>Ladle, Noor, Ole, Freya and Piet are made up for this example. Setting expectations, confirming and escalating errors follow Pearl (2016); feedback and visible options follow Norman (2013).</w:t>
+              <w:t>Ladle, Noor, Ole, Freya and Piet are made up for this example. Setting expectations, confirming and escalating errors follow Pearl (2016); feedback and visible options follow Norman (2013). The findings in the table of real evidence are real research results, rules and cases; the sources are listed below.</w:t>
             </w:r>
           </w:p>
         </w:tc>
@@ -4004,7 +4683,7 @@
           <w:color w:val="556274"/>
           <w:sz w:val="18"/>
         </w:rPr>
-        <w:t>Pearl 2016 · Cohen et al. 2004 · Norman 2013</w:t>
+        <w:t>Pearl 2016 · Cohen et al. 2004 · Norman 2013 · Nielsen 1994 · Cowan 2001</w:t>
       </w:r>
     </w:p>
     <w:p>
@@ -4239,6 +4918,319 @@
         <w:t>Figure 4 · One Ladle spoken answer, calm and busy. Shown here in its starting state; in the Neuro-UX Lab every version and every stress test can be used.</w:t>
       </w:r>
     </w:p>
+    <w:p>
+      <w:pPr>
+        <w:spacing w:before="0" w:after="100"/>
+      </w:pPr>
+      <w:r>
+        <w:rPr>
+          <w:b/>
+        </w:rPr>
+        <w:t>Predictable, light on memory, calm: evidence</w:t>
+      </w:r>
+    </w:p>
+    <w:tbl>
+      <w:tblPr>
+        <w:tblW w:w="9638" w:type="dxa"/>
+        <w:tblBorders>
+          <w:top w:val="single" w:sz="4" w:space="0" w:color="D5DEE9"/>
+          <w:left w:val="single" w:sz="4" w:space="0" w:color="D5DEE9"/>
+          <w:bottom w:val="single" w:sz="4" w:space="0" w:color="D5DEE9"/>
+          <w:right w:val="single" w:sz="4" w:space="0" w:color="D5DEE9"/>
+          <w:insideH w:val="single" w:sz="4" w:space="0" w:color="D5DEE9"/>
+          <w:insideV w:val="single" w:sz="4" w:space="0" w:color="D5DEE9"/>
+        </w:tblBorders>
+        <w:tblLayout w:type="fixed"/>
+        <w:tblCellMar>
+          <w:top w:w="60" w:type="dxa"/>
+          <w:left w:w="100" w:type="dxa"/>
+          <w:bottom w:w="60" w:type="dxa"/>
+          <w:right w:w="100" w:type="dxa"/>
+        </w:tblCellMar>
+      </w:tblPr>
+      <w:tblGrid>
+        <w:gridCol w:w="1860"/>
+        <w:gridCol w:w="4334"/>
+        <w:gridCol w:w="3444"/>
+      </w:tblGrid>
+      <w:tr>
+        <w:trPr>
+          <w:cantSplit/>
+          <w:tblHeader/>
+        </w:trPr>
+        <w:tc>
+          <w:tcPr>
+            <w:tcW w:type="dxa" w:w="1860"/>
+            <w:shd w:val="clear" w:color="auto" w:fill="E6ECF4"/>
+          </w:tcPr>
+          <w:p>
+            <w:pPr>
+              <w:spacing w:before="0" w:after="0"/>
+            </w:pPr>
+            <w:r>
+              <w:rPr>
+                <w:b/>
+                <w:sz w:val="20"/>
+              </w:rPr>
+              <w:t>Principle</w:t>
+            </w:r>
+          </w:p>
+        </w:tc>
+        <w:tc>
+          <w:tcPr>
+            <w:tcW w:type="dxa" w:w="4334"/>
+            <w:shd w:val="clear" w:color="auto" w:fill="E6ECF4"/>
+          </w:tcPr>
+          <w:p>
+            <w:pPr>
+              <w:spacing w:before="0" w:after="0"/>
+            </w:pPr>
+            <w:r>
+              <w:rPr>
+                <w:b/>
+                <w:sz w:val="20"/>
+              </w:rPr>
+              <w:t>Real finding</w:t>
+            </w:r>
+          </w:p>
+        </w:tc>
+        <w:tc>
+          <w:tcPr>
+            <w:tcW w:type="dxa" w:w="3444"/>
+            <w:shd w:val="clear" w:color="auto" w:fill="E6ECF4"/>
+          </w:tcPr>
+          <w:p>
+            <w:pPr>
+              <w:spacing w:before="0" w:after="0"/>
+            </w:pPr>
+            <w:r>
+              <w:rPr>
+                <w:b/>
+                <w:sz w:val="20"/>
+              </w:rPr>
+              <w:t>What it means for a voice screen</w:t>
+            </w:r>
+          </w:p>
+        </w:tc>
+      </w:tr>
+      <w:tr>
+        <w:trPr>
+          <w:cantSplit/>
+        </w:trPr>
+        <w:tc>
+          <w:tcPr>
+            <w:tcW w:type="dxa" w:w="1860"/>
+          </w:tcPr>
+          <w:p>
+            <w:pPr>
+              <w:spacing w:before="0" w:after="0"/>
+            </w:pPr>
+            <w:r>
+              <w:rPr>
+                <w:sz w:val="20"/>
+              </w:rPr>
+              <w:t>Light on memory</w:t>
+            </w:r>
+          </w:p>
+        </w:tc>
+        <w:tc>
+          <w:tcPr>
+            <w:tcW w:type="dxa" w:w="4334"/>
+          </w:tcPr>
+          <w:p>
+            <w:pPr>
+              <w:spacing w:before="0" w:after="0"/>
+            </w:pPr>
+            <w:r>
+              <w:rPr>
+                <w:sz w:val="20"/>
+              </w:rPr>
+              <w:t>People hold about four chunks in mind at once (Cowan 2001).</w:t>
+            </w:r>
+          </w:p>
+        </w:tc>
+        <w:tc>
+          <w:tcPr>
+            <w:tcW w:type="dxa" w:w="3444"/>
+          </w:tcPr>
+          <w:p>
+            <w:pPr>
+              <w:spacing w:before="0" w:after="0"/>
+            </w:pPr>
+            <w:r>
+              <w:rPr>
+                <w:sz w:val="20"/>
+              </w:rPr>
+              <w:t>Offer at most three options in one prompt, and say the most likely one first.</w:t>
+            </w:r>
+          </w:p>
+        </w:tc>
+      </w:tr>
+      <w:tr>
+        <w:trPr>
+          <w:cantSplit/>
+        </w:trPr>
+        <w:tc>
+          <w:tcPr>
+            <w:tcW w:type="dxa" w:w="1860"/>
+          </w:tcPr>
+          <w:p>
+            <w:pPr>
+              <w:spacing w:before="0" w:after="0"/>
+            </w:pPr>
+            <w:r>
+              <w:rPr>
+                <w:sz w:val="20"/>
+              </w:rPr>
+              <w:t>Less extraneous load</w:t>
+            </w:r>
+          </w:p>
+        </w:tc>
+        <w:tc>
+          <w:tcPr>
+            <w:tcW w:type="dxa" w:w="4334"/>
+          </w:tcPr>
+          <w:p>
+            <w:pPr>
+              <w:spacing w:before="0" w:after="0"/>
+            </w:pPr>
+            <w:r>
+              <w:rPr>
+                <w:sz w:val="20"/>
+              </w:rPr>
+              <w:t>Effort spent on working out the interface is missing for the task (Sweller 1988).</w:t>
+            </w:r>
+          </w:p>
+        </w:tc>
+        <w:tc>
+          <w:tcPr>
+            <w:tcW w:type="dxa" w:w="3444"/>
+          </w:tcPr>
+          <w:p>
+            <w:pPr>
+              <w:spacing w:before="0" w:after="0"/>
+            </w:pPr>
+            <w:r>
+              <w:rPr>
+                <w:sz w:val="20"/>
+              </w:rPr>
+              <w:t>Do not make people remember the commands: say them.</w:t>
+            </w:r>
+          </w:p>
+        </w:tc>
+      </w:tr>
+      <w:tr>
+        <w:trPr>
+          <w:cantSplit/>
+        </w:trPr>
+        <w:tc>
+          <w:tcPr>
+            <w:tcW w:type="dxa" w:w="1860"/>
+          </w:tcPr>
+          <w:p>
+            <w:pPr>
+              <w:spacing w:before="0" w:after="0"/>
+            </w:pPr>
+            <w:r>
+              <w:rPr>
+                <w:sz w:val="20"/>
+              </w:rPr>
+              <w:t>Load can be measured</w:t>
+            </w:r>
+          </w:p>
+        </w:tc>
+        <w:tc>
+          <w:tcPr>
+            <w:tcW w:type="dxa" w:w="4334"/>
+          </w:tcPr>
+          <w:p>
+            <w:pPr>
+              <w:spacing w:before="0" w:after="0"/>
+            </w:pPr>
+            <w:r>
+              <w:rPr>
+                <w:sz w:val="20"/>
+              </w:rPr>
+              <w:t>Distraction ratings of voice systems in cars ranged from 2.4 for the best system to 4.6 for the worst on a five-point scale (Strayer et al. 2015, as reported).</w:t>
+            </w:r>
+          </w:p>
+        </w:tc>
+        <w:tc>
+          <w:tcPr>
+            <w:tcW w:type="dxa" w:w="3444"/>
+          </w:tcPr>
+          <w:p>
+            <w:pPr>
+              <w:spacing w:before="0" w:after="0"/>
+            </w:pPr>
+            <w:r>
+              <w:rPr>
+                <w:sz w:val="20"/>
+              </w:rPr>
+              <w:t>Measure the load of a dialogue, for example with a dual task, before launch.</w:t>
+            </w:r>
+          </w:p>
+        </w:tc>
+      </w:tr>
+      <w:tr>
+        <w:trPr>
+          <w:cantSplit/>
+        </w:trPr>
+        <w:tc>
+          <w:tcPr>
+            <w:tcW w:type="dxa" w:w="1860"/>
+          </w:tcPr>
+          <w:p>
+            <w:pPr>
+              <w:spacing w:before="0" w:after="0"/>
+            </w:pPr>
+            <w:r>
+              <w:rPr>
+                <w:sz w:val="20"/>
+              </w:rPr>
+              <w:t>Mental models</w:t>
+            </w:r>
+          </w:p>
+        </w:tc>
+        <w:tc>
+          <w:tcPr>
+            <w:tcW w:type="dxa" w:w="4334"/>
+          </w:tcPr>
+          <w:p>
+            <w:pPr>
+              <w:spacing w:before="0" w:after="0"/>
+            </w:pPr>
+            <w:r>
+              <w:rPr>
+                <w:sz w:val="20"/>
+              </w:rPr>
+              <w:t>People act on what they believe a system is and does (Norman 2013).</w:t>
+            </w:r>
+          </w:p>
+        </w:tc>
+        <w:tc>
+          <w:tcPr>
+            <w:tcW w:type="dxa" w:w="3444"/>
+          </w:tcPr>
+          <w:p>
+            <w:pPr>
+              <w:spacing w:before="0" w:after="0"/>
+            </w:pPr>
+            <w:r>
+              <w:rPr>
+                <w:sz w:val="20"/>
+              </w:rPr>
+              <w:t>Tell the person what kind of assistant it is, and keep that behaviour stable.</w:t>
+            </w:r>
+          </w:p>
+        </w:tc>
+      </w:tr>
+    </w:tbl>
+    <w:p>
+      <w:pPr>
+        <w:spacing w:before="0" w:after="80"/>
+      </w:pPr>
+    </w:p>
     <w:tbl>
       <w:tblPr>
         <w:tblW w:w="9598" w:type="dxa"/>
@@ -4288,7 +5280,7 @@
             </w:pPr>
             <w:r>
               <w:rPr/>
-              <w:t>Ladle, Noor, Ole, Freya and Piet are made up for this example. The small capacity of working memory follows Cowan (2001); extra load leaving less for the task follows Sweller (1988); mental models follow Norman (2013).</w:t>
+              <w:t>Ladle, Noor, Ole, Freya and Piet are made up for this example. The small capacity of working memory follows Cowan (2001); extra load leaving less for the task follows Sweller (1988); mental models follow Norman (2013). The findings in the table of real evidence are real research results, rules and cases; the sources are listed below.</w:t>
             </w:r>
           </w:p>
         </w:tc>
@@ -4477,7 +5469,7 @@
           <w:color w:val="556274"/>
           <w:sz w:val="18"/>
         </w:rPr>
-        <w:t>Cowan 2001 · Sweller 1988 · Norman 2013</w:t>
+        <w:t>Cowan 2001 · Sweller 1988 · Norman 2013 · Strayer et al. 2015</w:t>
       </w:r>
     </w:p>
     <w:p>
@@ -4984,6 +5976,319 @@
         <w:spacing w:before="0" w:after="80"/>
       </w:pPr>
     </w:p>
+    <w:p>
+      <w:pPr>
+        <w:spacing w:before="0" w:after="100"/>
+      </w:pPr>
+      <w:r>
+        <w:rPr>
+          <w:b/>
+        </w:rPr>
+        <w:t>Prototyping and testing an AI interface: methods and findings</w:t>
+      </w:r>
+    </w:p>
+    <w:tbl>
+      <w:tblPr>
+        <w:tblW w:w="9638" w:type="dxa"/>
+        <w:tblBorders>
+          <w:top w:val="single" w:sz="4" w:space="0" w:color="D5DEE9"/>
+          <w:left w:val="single" w:sz="4" w:space="0" w:color="D5DEE9"/>
+          <w:bottom w:val="single" w:sz="4" w:space="0" w:color="D5DEE9"/>
+          <w:right w:val="single" w:sz="4" w:space="0" w:color="D5DEE9"/>
+          <w:insideH w:val="single" w:sz="4" w:space="0" w:color="D5DEE9"/>
+          <w:insideV w:val="single" w:sz="4" w:space="0" w:color="D5DEE9"/>
+        </w:tblBorders>
+        <w:tblLayout w:type="fixed"/>
+        <w:tblCellMar>
+          <w:top w:w="60" w:type="dxa"/>
+          <w:left w:w="100" w:type="dxa"/>
+          <w:bottom w:w="60" w:type="dxa"/>
+          <w:right w:w="100" w:type="dxa"/>
+        </w:tblCellMar>
+      </w:tblPr>
+      <w:tblGrid>
+        <w:gridCol w:w="1673"/>
+        <w:gridCol w:w="4519"/>
+        <w:gridCol w:w="3446"/>
+      </w:tblGrid>
+      <w:tr>
+        <w:trPr>
+          <w:cantSplit/>
+          <w:tblHeader/>
+        </w:trPr>
+        <w:tc>
+          <w:tcPr>
+            <w:tcW w:type="dxa" w:w="1673"/>
+            <w:shd w:val="clear" w:color="auto" w:fill="E6ECF4"/>
+          </w:tcPr>
+          <w:p>
+            <w:pPr>
+              <w:spacing w:before="0" w:after="0"/>
+            </w:pPr>
+            <w:r>
+              <w:rPr>
+                <w:b/>
+                <w:sz w:val="20"/>
+              </w:rPr>
+              <w:t>Method or finding</w:t>
+            </w:r>
+          </w:p>
+        </w:tc>
+        <w:tc>
+          <w:tcPr>
+            <w:tcW w:type="dxa" w:w="4519"/>
+            <w:shd w:val="clear" w:color="auto" w:fill="E6ECF4"/>
+          </w:tcPr>
+          <w:p>
+            <w:pPr>
+              <w:spacing w:before="0" w:after="0"/>
+            </w:pPr>
+            <w:r>
+              <w:rPr>
+                <w:b/>
+                <w:sz w:val="20"/>
+              </w:rPr>
+              <w:t>Real source</w:t>
+            </w:r>
+          </w:p>
+        </w:tc>
+        <w:tc>
+          <w:tcPr>
+            <w:tcW w:type="dxa" w:w="3446"/>
+            <w:shd w:val="clear" w:color="auto" w:fill="E6ECF4"/>
+          </w:tcPr>
+          <w:p>
+            <w:pPr>
+              <w:spacing w:before="0" w:after="0"/>
+            </w:pPr>
+            <w:r>
+              <w:rPr>
+                <w:b/>
+                <w:sz w:val="20"/>
+              </w:rPr>
+              <w:t>What it means for a test</w:t>
+            </w:r>
+          </w:p>
+        </w:tc>
+      </w:tr>
+      <w:tr>
+        <w:trPr>
+          <w:cantSplit/>
+        </w:trPr>
+        <w:tc>
+          <w:tcPr>
+            <w:tcW w:type="dxa" w:w="1673"/>
+          </w:tcPr>
+          <w:p>
+            <w:pPr>
+              <w:spacing w:before="0" w:after="0"/>
+            </w:pPr>
+            <w:r>
+              <w:rPr>
+                <w:sz w:val="20"/>
+              </w:rPr>
+              <w:t>Wizard of Oz</w:t>
+            </w:r>
+          </w:p>
+        </w:tc>
+        <w:tc>
+          <w:tcPr>
+            <w:tcW w:type="dxa" w:w="4519"/>
+          </w:tcPr>
+          <w:p>
+            <w:pPr>
+              <w:spacing w:before="0" w:after="0"/>
+            </w:pPr>
+            <w:r>
+              <w:rPr>
+                <w:sz w:val="20"/>
+              </w:rPr>
+              <w:t>In the 1984 study of natural language office applications, a person played the part of the system behind the screen, so the design could be tested before it was built (Kelley 1984).</w:t>
+            </w:r>
+          </w:p>
+        </w:tc>
+        <w:tc>
+          <w:tcPr>
+            <w:tcW w:type="dxa" w:w="3446"/>
+          </w:tcPr>
+          <w:p>
+            <w:pPr>
+              <w:spacing w:before="0" w:after="0"/>
+            </w:pPr>
+            <w:r>
+              <w:rPr>
+                <w:sz w:val="20"/>
+              </w:rPr>
+              <w:t>Test the dialogue with a hidden human first; build the recogniser later.</w:t>
+            </w:r>
+          </w:p>
+        </w:tc>
+      </w:tr>
+      <w:tr>
+        <w:trPr>
+          <w:cantSplit/>
+        </w:trPr>
+        <w:tc>
+          <w:tcPr>
+            <w:tcW w:type="dxa" w:w="1673"/>
+          </w:tcPr>
+          <w:p>
+            <w:pPr>
+              <w:spacing w:before="0" w:after="0"/>
+            </w:pPr>
+            <w:r>
+              <w:rPr>
+                <w:sz w:val="20"/>
+              </w:rPr>
+              <w:t>What a prototype is for</w:t>
+            </w:r>
+          </w:p>
+        </w:tc>
+        <w:tc>
+          <w:tcPr>
+            <w:tcW w:type="dxa" w:w="4519"/>
+          </w:tcPr>
+          <w:p>
+            <w:pPr>
+              <w:spacing w:before="0" w:after="0"/>
+            </w:pPr>
+            <w:r>
+              <w:rPr>
+                <w:sz w:val="20"/>
+              </w:rPr>
+              <w:t>A prototype can answer questions about the role of a product, about its look and feel, and about its implementation (Houde and Hill 1997).</w:t>
+            </w:r>
+          </w:p>
+        </w:tc>
+        <w:tc>
+          <w:tcPr>
+            <w:tcW w:type="dxa" w:w="3446"/>
+          </w:tcPr>
+          <w:p>
+            <w:pPr>
+              <w:spacing w:before="0" w:after="0"/>
+            </w:pPr>
+            <w:r>
+              <w:rPr>
+                <w:sz w:val="20"/>
+              </w:rPr>
+              <w:t>Say which of the three questions each prototype answers: functional, interaction or test prototype.</w:t>
+            </w:r>
+          </w:p>
+        </w:tc>
+      </w:tr>
+      <w:tr>
+        <w:trPr>
+          <w:cantSplit/>
+        </w:trPr>
+        <w:tc>
+          <w:tcPr>
+            <w:tcW w:type="dxa" w:w="1673"/>
+          </w:tcPr>
+          <w:p>
+            <w:pPr>
+              <w:spacing w:before="0" w:after="0"/>
+            </w:pPr>
+            <w:r>
+              <w:rPr>
+                <w:sz w:val="20"/>
+              </w:rPr>
+              <w:t>Test with all voices</w:t>
+            </w:r>
+          </w:p>
+        </w:tc>
+        <w:tc>
+          <w:tcPr>
+            <w:tcW w:type="dxa" w:w="4519"/>
+          </w:tcPr>
+          <w:p>
+            <w:pPr>
+              <w:spacing w:before="0" w:after="0"/>
+            </w:pPr>
+            <w:r>
+              <w:rPr>
+                <w:sz w:val="20"/>
+              </w:rPr>
+              <w:t>Recognition error rates differ between groups of speakers (Koenecke et al. 2020).</w:t>
+            </w:r>
+          </w:p>
+        </w:tc>
+        <w:tc>
+          <w:tcPr>
+            <w:tcW w:type="dxa" w:w="3446"/>
+          </w:tcPr>
+          <w:p>
+            <w:pPr>
+              <w:spacing w:before="0" w:after="0"/>
+            </w:pPr>
+            <w:r>
+              <w:rPr>
+                <w:sz w:val="20"/>
+              </w:rPr>
+              <w:t>Recruit test participants across accents, ages and speaking styles.</w:t>
+            </w:r>
+          </w:p>
+        </w:tc>
+      </w:tr>
+      <w:tr>
+        <w:trPr>
+          <w:cantSplit/>
+        </w:trPr>
+        <w:tc>
+          <w:tcPr>
+            <w:tcW w:type="dxa" w:w="1673"/>
+          </w:tcPr>
+          <w:p>
+            <w:pPr>
+              <w:spacing w:before="0" w:after="0"/>
+            </w:pPr>
+            <w:r>
+              <w:rPr>
+                <w:sz w:val="20"/>
+              </w:rPr>
+              <w:t>A test set is not the world</w:t>
+            </w:r>
+          </w:p>
+        </w:tc>
+        <w:tc>
+          <w:tcPr>
+            <w:tcW w:type="dxa" w:w="4519"/>
+          </w:tcPr>
+          <w:p>
+            <w:pPr>
+              <w:spacing w:before="0" w:after="0"/>
+            </w:pPr>
+            <w:r>
+              <w:rPr>
+                <w:sz w:val="20"/>
+              </w:rPr>
+              <w:t>A word error rate of 5.1% was measured on a standard telephone test set (Xiong et al. 2017).</w:t>
+            </w:r>
+          </w:p>
+        </w:tc>
+        <w:tc>
+          <w:tcPr>
+            <w:tcW w:type="dxa" w:w="3446"/>
+          </w:tcPr>
+          <w:p>
+            <w:pPr>
+              <w:spacing w:before="0" w:after="0"/>
+            </w:pPr>
+            <w:r>
+              <w:rPr>
+                <w:sz w:val="20"/>
+              </w:rPr>
+              <w:t>Test in the real setting: noise, half sentences, interruptions.</w:t>
+            </w:r>
+          </w:p>
+        </w:tc>
+      </w:tr>
+    </w:tbl>
+    <w:p>
+      <w:pPr>
+        <w:spacing w:before="0" w:after="80"/>
+      </w:pPr>
+    </w:p>
     <w:tbl>
       <w:tblPr>
         <w:tblW w:w="9598" w:type="dxa"/>
@@ -5033,7 +6338,7 @@
             </w:pPr>
             <w:r>
               <w:rPr/>
-              <w:t>Ladle, Noor, Ole, Freya and Piet are made up for this example. Choosing a prototype by its question follows Houde and Hill (1997); the Wizard-of-Oz method follows Kelley (1984).</w:t>
+              <w:t>Ladle, Noor, Ole, Freya and Piet are made up for this example. Choosing a prototype by its question follows Houde and Hill (1997); the Wizard-of-Oz method follows Kelley (1984). The findings in the table of real evidence are real research results, rules and cases; the sources are listed below.</w:t>
             </w:r>
           </w:p>
         </w:tc>
@@ -5222,7 +6527,7 @@
           <w:color w:val="556274"/>
           <w:sz w:val="18"/>
         </w:rPr>
-        <w:t>Houde &amp; Hill 1997 · Kelley 1984</w:t>
+        <w:t>Houde &amp; Hill 1997 · Kelley 1984 · Koenecke et al. 2020 · Xiong et al. 2017</w:t>
       </w:r>
     </w:p>
     <w:p>
@@ -5457,6 +6762,266 @@
         <w:t>Figure 7 · Ladle weighs three measures on effect on users, feasibility, risk and time pressure.</w:t>
       </w:r>
     </w:p>
+    <w:p>
+      <w:pPr>
+        <w:spacing w:before="0" w:after="100"/>
+      </w:pPr>
+      <w:r>
+        <w:rPr>
+          <w:b/>
+        </w:rPr>
+        <w:t>Where voice belongs: evidence</w:t>
+      </w:r>
+    </w:p>
+    <w:tbl>
+      <w:tblPr>
+        <w:tblW w:w="9638" w:type="dxa"/>
+        <w:tblBorders>
+          <w:top w:val="single" w:sz="4" w:space="0" w:color="D5DEE9"/>
+          <w:left w:val="single" w:sz="4" w:space="0" w:color="D5DEE9"/>
+          <w:bottom w:val="single" w:sz="4" w:space="0" w:color="D5DEE9"/>
+          <w:right w:val="single" w:sz="4" w:space="0" w:color="D5DEE9"/>
+          <w:insideH w:val="single" w:sz="4" w:space="0" w:color="D5DEE9"/>
+          <w:insideV w:val="single" w:sz="4" w:space="0" w:color="D5DEE9"/>
+        </w:tblBorders>
+        <w:tblLayout w:type="fixed"/>
+        <w:tblCellMar>
+          <w:top w:w="60" w:type="dxa"/>
+          <w:left w:w="100" w:type="dxa"/>
+          <w:bottom w:w="60" w:type="dxa"/>
+          <w:right w:w="100" w:type="dxa"/>
+        </w:tblCellMar>
+      </w:tblPr>
+      <w:tblGrid>
+        <w:gridCol w:w="1316"/>
+        <w:gridCol w:w="5213"/>
+        <w:gridCol w:w="3109"/>
+      </w:tblGrid>
+      <w:tr>
+        <w:trPr>
+          <w:cantSplit/>
+          <w:tblHeader/>
+        </w:trPr>
+        <w:tc>
+          <w:tcPr>
+            <w:tcW w:type="dxa" w:w="1316"/>
+            <w:shd w:val="clear" w:color="auto" w:fill="E6ECF4"/>
+          </w:tcPr>
+          <w:p>
+            <w:pPr>
+              <w:spacing w:before="0" w:after="0"/>
+            </w:pPr>
+            <w:r>
+              <w:rPr>
+                <w:b/>
+                <w:sz w:val="20"/>
+              </w:rPr>
+              <w:t>Topic</w:t>
+            </w:r>
+          </w:p>
+        </w:tc>
+        <w:tc>
+          <w:tcPr>
+            <w:tcW w:type="dxa" w:w="5213"/>
+            <w:shd w:val="clear" w:color="auto" w:fill="E6ECF4"/>
+          </w:tcPr>
+          <w:p>
+            <w:pPr>
+              <w:spacing w:before="0" w:after="0"/>
+            </w:pPr>
+            <w:r>
+              <w:rPr>
+                <w:b/>
+                <w:sz w:val="20"/>
+              </w:rPr>
+              <w:t>Real finding or rule</w:t>
+            </w:r>
+          </w:p>
+        </w:tc>
+        <w:tc>
+          <w:tcPr>
+            <w:tcW w:type="dxa" w:w="3109"/>
+            <w:shd w:val="clear" w:color="auto" w:fill="E6ECF4"/>
+          </w:tcPr>
+          <w:p>
+            <w:pPr>
+              <w:spacing w:before="0" w:after="0"/>
+            </w:pPr>
+            <w:r>
+              <w:rPr>
+                <w:b/>
+                <w:sz w:val="20"/>
+              </w:rPr>
+              <w:t>What it means for a measure</w:t>
+            </w:r>
+          </w:p>
+        </w:tc>
+      </w:tr>
+      <w:tr>
+        <w:trPr>
+          <w:cantSplit/>
+        </w:trPr>
+        <w:tc>
+          <w:tcPr>
+            <w:tcW w:type="dxa" w:w="1316"/>
+          </w:tcPr>
+          <w:p>
+            <w:pPr>
+              <w:spacing w:before="0" w:after="0"/>
+            </w:pPr>
+            <w:r>
+              <w:rPr>
+                <w:sz w:val="20"/>
+              </w:rPr>
+              <w:t>Good fit</w:t>
+            </w:r>
+          </w:p>
+        </w:tc>
+        <w:tc>
+          <w:tcPr>
+            <w:tcW w:type="dxa" w:w="5213"/>
+          </w:tcPr>
+          <w:p>
+            <w:pPr>
+              <w:spacing w:before="0" w:after="0"/>
+            </w:pPr>
+            <w:r>
+              <w:rPr>
+                <w:sz w:val="20"/>
+              </w:rPr>
+              <w:t>Hands and eyes are busy, the task is short and frequent, and the vocabulary is small (Pearl 2016).</w:t>
+            </w:r>
+          </w:p>
+        </w:tc>
+        <w:tc>
+          <w:tcPr>
+            <w:tcW w:type="dxa" w:w="3109"/>
+          </w:tcPr>
+          <w:p>
+            <w:pPr>
+              <w:spacing w:before="0" w:after="0"/>
+            </w:pPr>
+            <w:r>
+              <w:rPr>
+                <w:sz w:val="20"/>
+              </w:rPr>
+              <w:t>Choose voice for the tasks that fit this profile.</w:t>
+            </w:r>
+          </w:p>
+        </w:tc>
+      </w:tr>
+      <w:tr>
+        <w:trPr>
+          <w:cantSplit/>
+        </w:trPr>
+        <w:tc>
+          <w:tcPr>
+            <w:tcW w:type="dxa" w:w="1316"/>
+          </w:tcPr>
+          <w:p>
+            <w:pPr>
+              <w:spacing w:before="0" w:after="0"/>
+            </w:pPr>
+            <w:r>
+              <w:rPr>
+                <w:sz w:val="20"/>
+              </w:rPr>
+              <w:t>Poor fit</w:t>
+            </w:r>
+          </w:p>
+        </w:tc>
+        <w:tc>
+          <w:tcPr>
+            <w:tcW w:type="dxa" w:w="5213"/>
+          </w:tcPr>
+          <w:p>
+            <w:pPr>
+              <w:spacing w:before="0" w:after="0"/>
+            </w:pPr>
+            <w:r>
+              <w:rPr>
+                <w:sz w:val="20"/>
+              </w:rPr>
+              <w:t>Error rates differ between speakers (Koenecke et al. 2020), and invisible options make rare commands undiscoverable (Norman 2013).</w:t>
+            </w:r>
+          </w:p>
+        </w:tc>
+        <w:tc>
+          <w:tcPr>
+            <w:tcW w:type="dxa" w:w="3109"/>
+          </w:tcPr>
+          <w:p>
+            <w:pPr>
+              <w:spacing w:before="0" w:after="0"/>
+            </w:pPr>
+            <w:r>
+              <w:rPr>
+                <w:sz w:val="20"/>
+              </w:rPr>
+              <w:t>Keep a screen path for rare and sensitive tasks.</w:t>
+            </w:r>
+          </w:p>
+        </w:tc>
+      </w:tr>
+      <w:tr>
+        <w:trPr>
+          <w:cantSplit/>
+        </w:trPr>
+        <w:tc>
+          <w:tcPr>
+            <w:tcW w:type="dxa" w:w="1316"/>
+          </w:tcPr>
+          <w:p>
+            <w:pPr>
+              <w:spacing w:before="0" w:after="0"/>
+            </w:pPr>
+            <w:r>
+              <w:rPr>
+                <w:sz w:val="20"/>
+              </w:rPr>
+              <w:t>Risk in context</w:t>
+            </w:r>
+          </w:p>
+        </w:tc>
+        <w:tc>
+          <w:tcPr>
+            <w:tcW w:type="dxa" w:w="5213"/>
+          </w:tcPr>
+          <w:p>
+            <w:pPr>
+              <w:spacing w:before="0" w:after="0"/>
+            </w:pPr>
+            <w:r>
+              <w:rPr>
+                <w:sz w:val="20"/>
+              </w:rPr>
+              <w:t>Hands-free systems in cars still distract for many seconds after a task (Strayer et al. 2015, as reported).</w:t>
+            </w:r>
+          </w:p>
+        </w:tc>
+        <w:tc>
+          <w:tcPr>
+            <w:tcW w:type="dxa" w:w="3109"/>
+          </w:tcPr>
+          <w:p>
+            <w:pPr>
+              <w:spacing w:before="0" w:after="0"/>
+            </w:pPr>
+            <w:r>
+              <w:rPr>
+                <w:sz w:val="20"/>
+              </w:rPr>
+              <w:t>Rate each voice journey by the cost of a wrong action and of lost attention.</w:t>
+            </w:r>
+          </w:p>
+        </w:tc>
+      </w:tr>
+    </w:tbl>
+    <w:p>
+      <w:pPr>
+        <w:spacing w:before="0" w:after="80"/>
+      </w:pPr>
+    </w:p>
     <w:tbl>
       <w:tblPr>
         <w:tblW w:w="9598" w:type="dxa"/>
@@ -5506,7 +7071,7 @@
             </w:pPr>
             <w:r>
               <w:rPr/>
-              <w:t>Ladle, Noor, Ole, Freya and Piet are made up for this example. When voice is the wrong choice follows Pearl (2016); rating options on the same criteria with a reason follows Gibbons (2018). The four criteria are the ones the plan names for the case study.</w:t>
+              <w:t>Ladle, Noor, Ole, Freya and Piet are made up for this example. When voice is the wrong choice follows Pearl (2016); rating options on the same criteria with a reason follows Gibbons (2018). The four criteria are the ones the plan names for the case study. The findings in the table of real evidence are real research results, rules and cases; the sources are listed below.</w:t>
             </w:r>
           </w:p>
         </w:tc>
@@ -5695,7 +7260,7 @@
           <w:color w:val="556274"/>
           <w:sz w:val="18"/>
         </w:rPr>
-        <w:t>Pearl 2016 · Gibbons 2018</w:t>
+        <w:t>Pearl 2016 · Gibbons 2018 · Koenecke et al. 2020 · Strayer et al. 2015 · Norman 2013</w:t>
       </w:r>
     </w:p>
     <w:p>
@@ -6002,6 +7567,266 @@
         <w:t>Figure 9 · The layers of a voice service architecture, from a guiding vision to every touchpoint.</w:t>
       </w:r>
     </w:p>
+    <w:p>
+      <w:pPr>
+        <w:spacing w:before="0" w:after="100"/>
+      </w:pPr>
+      <w:r>
+        <w:rPr>
+          <w:b/>
+        </w:rPr>
+        <w:t>Voice as a service architecture: structures</w:t>
+      </w:r>
+    </w:p>
+    <w:tbl>
+      <w:tblPr>
+        <w:tblW w:w="9638" w:type="dxa"/>
+        <w:tblBorders>
+          <w:top w:val="single" w:sz="4" w:space="0" w:color="D5DEE9"/>
+          <w:left w:val="single" w:sz="4" w:space="0" w:color="D5DEE9"/>
+          <w:bottom w:val="single" w:sz="4" w:space="0" w:color="D5DEE9"/>
+          <w:right w:val="single" w:sz="4" w:space="0" w:color="D5DEE9"/>
+          <w:insideH w:val="single" w:sz="4" w:space="0" w:color="D5DEE9"/>
+          <w:insideV w:val="single" w:sz="4" w:space="0" w:color="D5DEE9"/>
+        </w:tblBorders>
+        <w:tblLayout w:type="fixed"/>
+        <w:tblCellMar>
+          <w:top w:w="60" w:type="dxa"/>
+          <w:left w:w="100" w:type="dxa"/>
+          <w:bottom w:w="60" w:type="dxa"/>
+          <w:right w:w="100" w:type="dxa"/>
+        </w:tblCellMar>
+      </w:tblPr>
+      <w:tblGrid>
+        <w:gridCol w:w="2552"/>
+        <w:gridCol w:w="4516"/>
+        <w:gridCol w:w="2570"/>
+      </w:tblGrid>
+      <w:tr>
+        <w:trPr>
+          <w:cantSplit/>
+          <w:tblHeader/>
+        </w:trPr>
+        <w:tc>
+          <w:tcPr>
+            <w:tcW w:type="dxa" w:w="2552"/>
+            <w:shd w:val="clear" w:color="auto" w:fill="E6ECF4"/>
+          </w:tcPr>
+          <w:p>
+            <w:pPr>
+              <w:spacing w:before="0" w:after="0"/>
+            </w:pPr>
+            <w:r>
+              <w:rPr>
+                <w:b/>
+                <w:sz w:val="20"/>
+              </w:rPr>
+              <w:t>Part</w:t>
+            </w:r>
+          </w:p>
+        </w:tc>
+        <w:tc>
+          <w:tcPr>
+            <w:tcW w:type="dxa" w:w="4516"/>
+            <w:shd w:val="clear" w:color="auto" w:fill="E6ECF4"/>
+          </w:tcPr>
+          <w:p>
+            <w:pPr>
+              <w:spacing w:before="0" w:after="0"/>
+            </w:pPr>
+            <w:r>
+              <w:rPr>
+                <w:b/>
+                <w:sz w:val="20"/>
+              </w:rPr>
+              <w:t>Real example or source</w:t>
+            </w:r>
+          </w:p>
+        </w:tc>
+        <w:tc>
+          <w:tcPr>
+            <w:tcW w:type="dxa" w:w="2570"/>
+            <w:shd w:val="clear" w:color="auto" w:fill="E6ECF4"/>
+          </w:tcPr>
+          <w:p>
+            <w:pPr>
+              <w:spacing w:before="0" w:after="0"/>
+            </w:pPr>
+            <w:r>
+              <w:rPr>
+                <w:b/>
+                <w:sz w:val="20"/>
+              </w:rPr>
+              <w:t>What it means</w:t>
+            </w:r>
+          </w:p>
+        </w:tc>
+      </w:tr>
+      <w:tr>
+        <w:trPr>
+          <w:cantSplit/>
+        </w:trPr>
+        <w:tc>
+          <w:tcPr>
+            <w:tcW w:type="dxa" w:w="2552"/>
+          </w:tcPr>
+          <w:p>
+            <w:pPr>
+              <w:spacing w:before="0" w:after="0"/>
+            </w:pPr>
+            <w:r>
+              <w:rPr>
+                <w:sz w:val="20"/>
+              </w:rPr>
+              <w:t>Principles for speaking, confirming and failing</w:t>
+            </w:r>
+          </w:p>
+        </w:tc>
+        <w:tc>
+          <w:tcPr>
+            <w:tcW w:type="dxa" w:w="4516"/>
+          </w:tcPr>
+          <w:p>
+            <w:pPr>
+              <w:spacing w:before="0" w:after="0"/>
+            </w:pPr>
+            <w:r>
+              <w:rPr>
+                <w:sz w:val="20"/>
+              </w:rPr>
+              <w:t>Voice design practice treats the persona, the prompts, the confirmation and the recovery as one designed whole (Cohen et al. 2004; Pearl 2016).</w:t>
+            </w:r>
+          </w:p>
+        </w:tc>
+        <w:tc>
+          <w:tcPr>
+            <w:tcW w:type="dxa" w:w="2570"/>
+          </w:tcPr>
+          <w:p>
+            <w:pPr>
+              <w:spacing w:before="0" w:after="0"/>
+            </w:pPr>
+            <w:r>
+              <w:rPr>
+                <w:sz w:val="20"/>
+              </w:rPr>
+              <w:t>Define the principles once, for every voice journey.</w:t>
+            </w:r>
+          </w:p>
+        </w:tc>
+      </w:tr>
+      <w:tr>
+        <w:trPr>
+          <w:cantSplit/>
+        </w:trPr>
+        <w:tc>
+          <w:tcPr>
+            <w:tcW w:type="dxa" w:w="2552"/>
+          </w:tcPr>
+          <w:p>
+            <w:pPr>
+              <w:spacing w:before="0" w:after="0"/>
+            </w:pPr>
+            <w:r>
+              <w:rPr>
+                <w:sz w:val="20"/>
+              </w:rPr>
+              <w:t>A duty to tell</w:t>
+            </w:r>
+          </w:p>
+        </w:tc>
+        <w:tc>
+          <w:tcPr>
+            <w:tcW w:type="dxa" w:w="4516"/>
+          </w:tcPr>
+          <w:p>
+            <w:pPr>
+              <w:spacing w:before="0" w:after="0"/>
+            </w:pPr>
+            <w:r>
+              <w:rPr>
+                <w:sz w:val="20"/>
+              </w:rPr>
+              <w:t>The EU AI Act (Article 50) requires that people are told when they interact with an AI system, unless that is obvious from the context.</w:t>
+            </w:r>
+          </w:p>
+        </w:tc>
+        <w:tc>
+          <w:tcPr>
+            <w:tcW w:type="dxa" w:w="2570"/>
+          </w:tcPr>
+          <w:p>
+            <w:pPr>
+              <w:spacing w:before="0" w:after="0"/>
+            </w:pPr>
+            <w:r>
+              <w:rPr>
+                <w:sz w:val="20"/>
+              </w:rPr>
+              <w:t>Make the voice announce what it is.</w:t>
+            </w:r>
+          </w:p>
+        </w:tc>
+      </w:tr>
+      <w:tr>
+        <w:trPr>
+          <w:cantSplit/>
+        </w:trPr>
+        <w:tc>
+          <w:tcPr>
+            <w:tcW w:type="dxa" w:w="2552"/>
+          </w:tcPr>
+          <w:p>
+            <w:pPr>
+              <w:spacing w:before="0" w:after="0"/>
+            </w:pPr>
+            <w:r>
+              <w:rPr>
+                <w:sz w:val="20"/>
+              </w:rPr>
+              <w:t>Discoverability</w:t>
+            </w:r>
+          </w:p>
+        </w:tc>
+        <w:tc>
+          <w:tcPr>
+            <w:tcW w:type="dxa" w:w="4516"/>
+          </w:tcPr>
+          <w:p>
+            <w:pPr>
+              <w:spacing w:before="0" w:after="0"/>
+            </w:pPr>
+            <w:r>
+              <w:rPr>
+                <w:sz w:val="20"/>
+              </w:rPr>
+              <w:t>Voice leaves the options invisible (Norman 2013).</w:t>
+            </w:r>
+          </w:p>
+        </w:tc>
+        <w:tc>
+          <w:tcPr>
+            <w:tcW w:type="dxa" w:w="2570"/>
+          </w:tcPr>
+          <w:p>
+            <w:pPr>
+              <w:spacing w:before="0" w:after="0"/>
+            </w:pPr>
+            <w:r>
+              <w:rPr>
+                <w:sz w:val="20"/>
+              </w:rPr>
+              <w:t>Plan where the screen shows what the voice can do.</w:t>
+            </w:r>
+          </w:p>
+        </w:tc>
+      </w:tr>
+    </w:tbl>
+    <w:p>
+      <w:pPr>
+        <w:spacing w:before="0" w:after="80"/>
+      </w:pPr>
+    </w:p>
     <w:tbl>
       <w:tblPr>
         <w:tblW w:w="9598" w:type="dxa"/>
@@ -6051,7 +7876,7 @@
             </w:pPr>
             <w:r>
               <w:rPr/>
-              <w:t>Ladle, Noor, Ole, Freya and Piet are made up for this example. The design of spoken services follows Pearl (2016).</w:t>
+              <w:t>Ladle, Noor, Ole, Freya and Piet are made up for this example. The design of spoken services follows Pearl (2016). The findings in the table of real evidence are real research results, rules and cases; the sources are listed below.</w:t>
             </w:r>
           </w:p>
         </w:tc>
@@ -6240,7 +8065,7 @@
           <w:color w:val="556274"/>
           <w:sz w:val="18"/>
         </w:rPr>
-        <w:t>Pearl 2016 · Norman 2013</w:t>
+        <w:t>Pearl 2016 · Norman 2013 · Cohen et al. 2004 · EU AI Act 2024</w:t>
       </w:r>
     </w:p>
     <w:p>
@@ -6733,6 +8558,266 @@
         <w:spacing w:before="0" w:after="80"/>
       </w:pPr>
     </w:p>
+    <w:p>
+      <w:pPr>
+        <w:spacing w:before="0" w:after="100"/>
+      </w:pPr>
+      <w:r>
+        <w:rPr>
+          <w:b/>
+        </w:rPr>
+        <w:t>Conflicts of voice, with evidence</w:t>
+      </w:r>
+    </w:p>
+    <w:tbl>
+      <w:tblPr>
+        <w:tblW w:w="9638" w:type="dxa"/>
+        <w:tblBorders>
+          <w:top w:val="single" w:sz="4" w:space="0" w:color="D5DEE9"/>
+          <w:left w:val="single" w:sz="4" w:space="0" w:color="D5DEE9"/>
+          <w:bottom w:val="single" w:sz="4" w:space="0" w:color="D5DEE9"/>
+          <w:right w:val="single" w:sz="4" w:space="0" w:color="D5DEE9"/>
+          <w:insideH w:val="single" w:sz="4" w:space="0" w:color="D5DEE9"/>
+          <w:insideV w:val="single" w:sz="4" w:space="0" w:color="D5DEE9"/>
+        </w:tblBorders>
+        <w:tblLayout w:type="fixed"/>
+        <w:tblCellMar>
+          <w:top w:w="60" w:type="dxa"/>
+          <w:left w:w="100" w:type="dxa"/>
+          <w:bottom w:w="60" w:type="dxa"/>
+          <w:right w:w="100" w:type="dxa"/>
+        </w:tblCellMar>
+      </w:tblPr>
+      <w:tblGrid>
+        <w:gridCol w:w="2343"/>
+        <w:gridCol w:w="4419"/>
+        <w:gridCol w:w="2876"/>
+      </w:tblGrid>
+      <w:tr>
+        <w:trPr>
+          <w:cantSplit/>
+          <w:tblHeader/>
+        </w:trPr>
+        <w:tc>
+          <w:tcPr>
+            <w:tcW w:type="dxa" w:w="2343"/>
+            <w:shd w:val="clear" w:color="auto" w:fill="E6ECF4"/>
+          </w:tcPr>
+          <w:p>
+            <w:pPr>
+              <w:spacing w:before="0" w:after="0"/>
+            </w:pPr>
+            <w:r>
+              <w:rPr>
+                <w:b/>
+                <w:sz w:val="20"/>
+              </w:rPr>
+              <w:t>Conflict</w:t>
+            </w:r>
+          </w:p>
+        </w:tc>
+        <w:tc>
+          <w:tcPr>
+            <w:tcW w:type="dxa" w:w="4419"/>
+            <w:shd w:val="clear" w:color="auto" w:fill="E6ECF4"/>
+          </w:tcPr>
+          <w:p>
+            <w:pPr>
+              <w:spacing w:before="0" w:after="0"/>
+            </w:pPr>
+            <w:r>
+              <w:rPr>
+                <w:b/>
+                <w:sz w:val="20"/>
+              </w:rPr>
+              <w:t>What the evidence says</w:t>
+            </w:r>
+          </w:p>
+        </w:tc>
+        <w:tc>
+          <w:tcPr>
+            <w:tcW w:type="dxa" w:w="2876"/>
+            <w:shd w:val="clear" w:color="auto" w:fill="E6ECF4"/>
+          </w:tcPr>
+          <w:p>
+            <w:pPr>
+              <w:spacing w:before="0" w:after="0"/>
+            </w:pPr>
+            <w:r>
+              <w:rPr>
+                <w:b/>
+                <w:sz w:val="20"/>
+              </w:rPr>
+              <w:t>A way to decide</w:t>
+            </w:r>
+          </w:p>
+        </w:tc>
+      </w:tr>
+      <w:tr>
+        <w:trPr>
+          <w:cantSplit/>
+        </w:trPr>
+        <w:tc>
+          <w:tcPr>
+            <w:tcW w:type="dxa" w:w="2343"/>
+          </w:tcPr>
+          <w:p>
+            <w:pPr>
+              <w:spacing w:before="0" w:after="0"/>
+            </w:pPr>
+            <w:r>
+              <w:rPr>
+                <w:sz w:val="20"/>
+              </w:rPr>
+              <w:t>Comfort against precision</w:t>
+            </w:r>
+          </w:p>
+        </w:tc>
+        <w:tc>
+          <w:tcPr>
+            <w:tcW w:type="dxa" w:w="4419"/>
+          </w:tcPr>
+          <w:p>
+            <w:pPr>
+              <w:spacing w:before="0" w:after="0"/>
+            </w:pPr>
+            <w:r>
+              <w:rPr>
+                <w:sz w:val="20"/>
+              </w:rPr>
+              <w:t>Word error rates of 0.19 to 0.35 were found across the speakers of five systems (Koenecke et al. 2020).</w:t>
+            </w:r>
+          </w:p>
+        </w:tc>
+        <w:tc>
+          <w:tcPr>
+            <w:tcW w:type="dxa" w:w="2876"/>
+          </w:tcPr>
+          <w:p>
+            <w:pPr>
+              <w:spacing w:before="0" w:after="0"/>
+            </w:pPr>
+            <w:r>
+              <w:rPr>
+                <w:sz w:val="20"/>
+              </w:rPr>
+              <w:t>Ask what happens if it hears the wrong word here, and confirm where the cost is high.</w:t>
+            </w:r>
+          </w:p>
+        </w:tc>
+      </w:tr>
+      <w:tr>
+        <w:trPr>
+          <w:cantSplit/>
+        </w:trPr>
+        <w:tc>
+          <w:tcPr>
+            <w:tcW w:type="dxa" w:w="2343"/>
+          </w:tcPr>
+          <w:p>
+            <w:pPr>
+              <w:spacing w:before="0" w:after="0"/>
+            </w:pPr>
+            <w:r>
+              <w:rPr>
+                <w:sz w:val="20"/>
+              </w:rPr>
+              <w:t>Natural conversation against robustness</w:t>
+            </w:r>
+          </w:p>
+        </w:tc>
+        <w:tc>
+          <w:tcPr>
+            <w:tcW w:type="dxa" w:w="4419"/>
+          </w:tcPr>
+          <w:p>
+            <w:pPr>
+              <w:spacing w:before="0" w:after="0"/>
+            </w:pPr>
+            <w:r>
+              <w:rPr>
+                <w:sz w:val="20"/>
+              </w:rPr>
+              <w:t>A test result of 5.1% on a standard set does not predict the failure rate in real use (Xiong et al. 2017).</w:t>
+            </w:r>
+          </w:p>
+        </w:tc>
+        <w:tc>
+          <w:tcPr>
+            <w:tcW w:type="dxa" w:w="2876"/>
+          </w:tcPr>
+          <w:p>
+            <w:pPr>
+              <w:spacing w:before="0" w:after="0"/>
+            </w:pPr>
+            <w:r>
+              <w:rPr>
+                <w:sz w:val="20"/>
+              </w:rPr>
+              <w:t>Plan how often it will fail and where the person goes then.</w:t>
+            </w:r>
+          </w:p>
+        </w:tc>
+      </w:tr>
+      <w:tr>
+        <w:trPr>
+          <w:cantSplit/>
+        </w:trPr>
+        <w:tc>
+          <w:tcPr>
+            <w:tcW w:type="dxa" w:w="2343"/>
+          </w:tcPr>
+          <w:p>
+            <w:pPr>
+              <w:spacing w:before="0" w:after="0"/>
+            </w:pPr>
+            <w:r>
+              <w:rPr>
+                <w:sz w:val="20"/>
+              </w:rPr>
+              <w:t>Innovation against trust</w:t>
+            </w:r>
+          </w:p>
+        </w:tc>
+        <w:tc>
+          <w:tcPr>
+            <w:tcW w:type="dxa" w:w="4419"/>
+          </w:tcPr>
+          <w:p>
+            <w:pPr>
+              <w:spacing w:before="0" w:after="0"/>
+            </w:pPr>
+            <w:r>
+              <w:rPr>
+                <w:sz w:val="20"/>
+              </w:rPr>
+              <w:t>Distraction after hands-free tasks lasted up to 27 seconds in the weakest systems (Strayer et al. 2015, as reported).</w:t>
+            </w:r>
+          </w:p>
+        </w:tc>
+        <w:tc>
+          <w:tcPr>
+            <w:tcW w:type="dxa" w:w="2876"/>
+          </w:tcPr>
+          <w:p>
+            <w:pPr>
+              <w:spacing w:before="0" w:after="0"/>
+            </w:pPr>
+            <w:r>
+              <w:rPr>
+                <w:sz w:val="20"/>
+              </w:rPr>
+              <w:t>Plan what happens after its first public mistake.</w:t>
+            </w:r>
+          </w:p>
+        </w:tc>
+      </w:tr>
+    </w:tbl>
+    <w:p>
+      <w:pPr>
+        <w:spacing w:before="0" w:after="80"/>
+      </w:pPr>
+    </w:p>
     <w:tbl>
       <w:tblPr>
         <w:tblW w:w="9598" w:type="dxa"/>
@@ -6782,7 +8867,7 @@
             </w:pPr>
             <w:r>
               <w:rPr/>
-              <w:t>Ladle, Noor, Ole, Freya and Piet are made up for this example. The conflicts are a reading of the example, not a rule for every product.</w:t>
+              <w:t>Ladle, Noor, Ole, Freya and Piet are made up for this example. The conflicts are a reading of the example, not a rule for every product. The findings in the table of real evidence are real research results, rules and cases; the sources are listed below.</w:t>
             </w:r>
           </w:p>
         </w:tc>
@@ -6971,7 +9056,7 @@
           <w:color w:val="556274"/>
           <w:sz w:val="18"/>
         </w:rPr>
-        <w:t>Pearl 2016 · Cowan 2001</w:t>
+        <w:t>Pearl 2016 · Cowan 2001 · Koenecke et al. 2020 · Xiong et al. 2017 · Strayer et al. 2015</w:t>
       </w:r>
     </w:p>
     <w:p>
@@ -7464,6 +9549,266 @@
         <w:spacing w:before="0" w:after="80"/>
       </w:pPr>
     </w:p>
+    <w:p>
+      <w:pPr>
+        <w:spacing w:before="0" w:after="100"/>
+      </w:pPr>
+      <w:r>
+        <w:rPr>
+          <w:b/>
+        </w:rPr>
+        <w:t>Voice governance: test standards and rules</w:t>
+      </w:r>
+    </w:p>
+    <w:tbl>
+      <w:tblPr>
+        <w:tblW w:w="9638" w:type="dxa"/>
+        <w:tblBorders>
+          <w:top w:val="single" w:sz="4" w:space="0" w:color="D5DEE9"/>
+          <w:left w:val="single" w:sz="4" w:space="0" w:color="D5DEE9"/>
+          <w:bottom w:val="single" w:sz="4" w:space="0" w:color="D5DEE9"/>
+          <w:right w:val="single" w:sz="4" w:space="0" w:color="D5DEE9"/>
+          <w:insideH w:val="single" w:sz="4" w:space="0" w:color="D5DEE9"/>
+          <w:insideV w:val="single" w:sz="4" w:space="0" w:color="D5DEE9"/>
+        </w:tblBorders>
+        <w:tblLayout w:type="fixed"/>
+        <w:tblCellMar>
+          <w:top w:w="60" w:type="dxa"/>
+          <w:left w:w="100" w:type="dxa"/>
+          <w:bottom w:w="60" w:type="dxa"/>
+          <w:right w:w="100" w:type="dxa"/>
+        </w:tblCellMar>
+      </w:tblPr>
+      <w:tblGrid>
+        <w:gridCol w:w="1806"/>
+        <w:gridCol w:w="4641"/>
+        <w:gridCol w:w="3191"/>
+      </w:tblGrid>
+      <w:tr>
+        <w:trPr>
+          <w:cantSplit/>
+          <w:tblHeader/>
+        </w:trPr>
+        <w:tc>
+          <w:tcPr>
+            <w:tcW w:type="dxa" w:w="1806"/>
+            <w:shd w:val="clear" w:color="auto" w:fill="E6ECF4"/>
+          </w:tcPr>
+          <w:p>
+            <w:pPr>
+              <w:spacing w:before="0" w:after="0"/>
+            </w:pPr>
+            <w:r>
+              <w:rPr>
+                <w:b/>
+                <w:sz w:val="20"/>
+              </w:rPr>
+              <w:t>Part</w:t>
+            </w:r>
+          </w:p>
+        </w:tc>
+        <w:tc>
+          <w:tcPr>
+            <w:tcW w:type="dxa" w:w="4641"/>
+            <w:shd w:val="clear" w:color="auto" w:fill="E6ECF4"/>
+          </w:tcPr>
+          <w:p>
+            <w:pPr>
+              <w:spacing w:before="0" w:after="0"/>
+            </w:pPr>
+            <w:r>
+              <w:rPr>
+                <w:b/>
+                <w:sz w:val="20"/>
+              </w:rPr>
+              <w:t>Real example or rule</w:t>
+            </w:r>
+          </w:p>
+        </w:tc>
+        <w:tc>
+          <w:tcPr>
+            <w:tcW w:type="dxa" w:w="3191"/>
+            <w:shd w:val="clear" w:color="auto" w:fill="E6ECF4"/>
+          </w:tcPr>
+          <w:p>
+            <w:pPr>
+              <w:spacing w:before="0" w:after="0"/>
+            </w:pPr>
+            <w:r>
+              <w:rPr>
+                <w:b/>
+                <w:sz w:val="20"/>
+              </w:rPr>
+              <w:t>What it means</w:t>
+            </w:r>
+          </w:p>
+        </w:tc>
+      </w:tr>
+      <w:tr>
+        <w:trPr>
+          <w:cantSplit/>
+        </w:trPr>
+        <w:tc>
+          <w:tcPr>
+            <w:tcW w:type="dxa" w:w="1806"/>
+          </w:tcPr>
+          <w:p>
+            <w:pPr>
+              <w:spacing w:before="0" w:after="0"/>
+            </w:pPr>
+            <w:r>
+              <w:rPr>
+                <w:sz w:val="20"/>
+              </w:rPr>
+              <w:t>Test standards by risk</w:t>
+            </w:r>
+          </w:p>
+        </w:tc>
+        <w:tc>
+          <w:tcPr>
+            <w:tcW w:type="dxa" w:w="4641"/>
+          </w:tcPr>
+          <w:p>
+            <w:pPr>
+              <w:spacing w:before="0" w:after="0"/>
+            </w:pPr>
+            <w:r>
+              <w:rPr>
+                <w:sz w:val="20"/>
+              </w:rPr>
+              <w:t>The automotive study rated ten systems with 257 drivers on a common scale, and a rating of 2 or more counted as potentially dangerous (Strayer et al. 2015, as reported).</w:t>
+            </w:r>
+          </w:p>
+        </w:tc>
+        <w:tc>
+          <w:tcPr>
+            <w:tcW w:type="dxa" w:w="3191"/>
+          </w:tcPr>
+          <w:p>
+            <w:pPr>
+              <w:spacing w:before="0" w:after="0"/>
+            </w:pPr>
+            <w:r>
+              <w:rPr>
+                <w:sz w:val="20"/>
+              </w:rPr>
+              <w:t>Define the test and the threshold before the launch, by risk level.</w:t>
+            </w:r>
+          </w:p>
+        </w:tc>
+      </w:tr>
+      <w:tr>
+        <w:trPr>
+          <w:cantSplit/>
+        </w:trPr>
+        <w:tc>
+          <w:tcPr>
+            <w:tcW w:type="dxa" w:w="1806"/>
+          </w:tcPr>
+          <w:p>
+            <w:pPr>
+              <w:spacing w:before="0" w:after="0"/>
+            </w:pPr>
+            <w:r>
+              <w:rPr>
+                <w:sz w:val="20"/>
+              </w:rPr>
+              <w:t>Who may stop a launch</w:t>
+            </w:r>
+          </w:p>
+        </w:tc>
+        <w:tc>
+          <w:tcPr>
+            <w:tcW w:type="dxa" w:w="4641"/>
+          </w:tcPr>
+          <w:p>
+            <w:pPr>
+              <w:spacing w:before="0" w:after="0"/>
+            </w:pPr>
+            <w:r>
+              <w:rPr>
+                <w:sz w:val="20"/>
+              </w:rPr>
+              <w:t>Differences in recognition between groups of speakers were found only because the systems were tested across groups (Koenecke et al. 2020).</w:t>
+            </w:r>
+          </w:p>
+        </w:tc>
+        <w:tc>
+          <w:tcPr>
+            <w:tcW w:type="dxa" w:w="3191"/>
+          </w:tcPr>
+          <w:p>
+            <w:pPr>
+              <w:spacing w:before="0" w:after="0"/>
+            </w:pPr>
+            <w:r>
+              <w:rPr>
+                <w:sz w:val="20"/>
+              </w:rPr>
+              <w:t>Give a test board with UX research, the domain experts and support the right to stop.</w:t>
+            </w:r>
+          </w:p>
+        </w:tc>
+      </w:tr>
+      <w:tr>
+        <w:trPr>
+          <w:cantSplit/>
+        </w:trPr>
+        <w:tc>
+          <w:tcPr>
+            <w:tcW w:type="dxa" w:w="1806"/>
+          </w:tcPr>
+          <w:p>
+            <w:pPr>
+              <w:spacing w:before="0" w:after="0"/>
+            </w:pPr>
+            <w:r>
+              <w:rPr>
+                <w:sz w:val="20"/>
+              </w:rPr>
+              <w:t>The duty to inform</w:t>
+            </w:r>
+          </w:p>
+        </w:tc>
+        <w:tc>
+          <w:tcPr>
+            <w:tcW w:type="dxa" w:w="4641"/>
+          </w:tcPr>
+          <w:p>
+            <w:pPr>
+              <w:spacing w:before="0" w:after="0"/>
+            </w:pPr>
+            <w:r>
+              <w:rPr>
+                <w:sz w:val="20"/>
+              </w:rPr>
+              <w:t>EU AI Act, Article 50.</w:t>
+            </w:r>
+          </w:p>
+        </w:tc>
+        <w:tc>
+          <w:tcPr>
+            <w:tcW w:type="dxa" w:w="3191"/>
+          </w:tcPr>
+          <w:p>
+            <w:pPr>
+              <w:spacing w:before="0" w:after="0"/>
+            </w:pPr>
+            <w:r>
+              <w:rPr>
+                <w:sz w:val="20"/>
+              </w:rPr>
+              <w:t>Add the notice to the release checklist.</w:t>
+            </w:r>
+          </w:p>
+        </w:tc>
+      </w:tr>
+    </w:tbl>
+    <w:p>
+      <w:pPr>
+        <w:spacing w:before="0" w:after="80"/>
+      </w:pPr>
+    </w:p>
     <w:tbl>
       <w:tblPr>
         <w:tblW w:w="9598" w:type="dxa"/>
@@ -7513,7 +9858,7 @@
             </w:pPr>
             <w:r>
               <w:rPr/>
-              <w:t>Ladle, Noor, Ole, Freya and Piet are made up for this example. Deciding with limited information follows Simon (1956); the premortem follows Klein (2007).</w:t>
+              <w:t>Ladle, Noor, Ole, Freya and Piet are made up for this example. Deciding with limited information follows Simon (1956); the premortem follows Klein (2007). The findings in the table of real evidence are real research results, rules and cases; the sources are listed below.</w:t>
             </w:r>
           </w:p>
         </w:tc>
@@ -7702,7 +10047,7 @@
           <w:color w:val="556274"/>
           <w:sz w:val="18"/>
         </w:rPr>
-        <w:t>Simon 1956 · Klein 2007</w:t>
+        <w:t>Simon 1956 · Klein 2007 · Strayer et al. 2015 · Koenecke et al. 2020 · EU AI Act 2024</w:t>
       </w:r>
     </w:p>
     <w:p>
@@ -8375,7 +10720,67 @@
         <w:rPr>
           <w:sz w:val="19"/>
         </w:rPr>
+        <w:t>Xiong, W., Droppo, J., Huang, X., et al. (2017). The Microsoft 2017 conversational speech recognition system. arXiv:1708.06073. https://arxiv.org/abs/1708.06073 (A word error rate of 5.1% on the NIST 2000 Switchboard test set, reported as matching a careful human transcription benchmark; a result on one test set, not in real use.)</w:t>
+      </w:r>
+    </w:p>
+    <w:p>
+      <w:pPr>
+        <w:spacing w:before="0" w:after="80"/>
+        <w:ind w:left="283" w:hanging="283"/>
+      </w:pPr>
+      <w:r>
+        <w:rPr>
+          <w:sz w:val="19"/>
+        </w:rPr>
+        <w:t>Koenecke, A., Nam, A., Lake, E., et al. (2020). Racial disparities in automated speech recognition. PNAS, 117(14), 7684–7689. https://doi.org/10.1073/pnas.1915768117 (Five commercial systems had an average word error rate of 0.35 for Black speakers and 0.19 for white speakers.)</w:t>
+      </w:r>
+    </w:p>
+    <w:p>
+      <w:pPr>
+        <w:spacing w:before="0" w:after="80"/>
+        <w:ind w:left="283" w:hanging="283"/>
+      </w:pPr>
+      <w:r>
+        <w:rPr>
+          <w:sz w:val="19"/>
+        </w:rPr>
+        <w:t>Strayer, D. L., Cooper, J. M., Turrill, J., et al. (2015). Measuring Cognitive Distraction in the Automobile III: A Comparison of Ten 2015 In-Vehicle Information Systems. AAA Foundation for Traffic Safety. (Mental distraction lasted up to 27 seconds after a task in the worst-performing systems; figures from press coverage, check the report.)</w:t>
+      </w:r>
+    </w:p>
+    <w:p>
+      <w:pPr>
+        <w:spacing w:before="0" w:after="80"/>
+        <w:ind w:left="283" w:hanging="283"/>
+      </w:pPr>
+      <w:r>
+        <w:rPr>
+          <w:sz w:val="19"/>
+        </w:rPr>
+        <w:t>W3C (2023). Web Content Accessibility Guidelines (WCAG) 2.2. https://www.w3.org/TR/WCAG22/ (Success criterion 1.4.1 Use of Color: colour must not be the only way to convey information; 1.4.3 Contrast (Minimum) for text.)</w:t>
+      </w:r>
+    </w:p>
+    <w:p>
+      <w:pPr>
+        <w:spacing w:before="0" w:after="80"/>
+        <w:ind w:left="283" w:hanging="283"/>
+      </w:pPr>
+      <w:r>
+        <w:rPr>
+          <w:sz w:val="19"/>
+        </w:rPr>
         <w:t>Norman, D. A. (2013). The Design of Everyday Things (revised and expanded edition). Basic Books. (Mental models and conceptual models: a design works when what people believe it does matches what it does.)</w:t>
+      </w:r>
+    </w:p>
+    <w:p>
+      <w:pPr>
+        <w:spacing w:before="0" w:after="80"/>
+        <w:ind w:left="283" w:hanging="283"/>
+      </w:pPr>
+      <w:r>
+        <w:rPr>
+          <w:sz w:val="19"/>
+        </w:rPr>
+        <w:t>Nielsen, J. (1994, reviewed 2024). 10 Usability Heuristics for User Interface Design. Nielsen Norman Group. https://www.nngroup.com/articles/ten-usability-heuristics/ (Visibility of system status, consistency and standards, recognition rather than recall, aesthetic and minimalist design.)</w:t>
       </w:r>
     </w:p>
     <w:p>
@@ -8436,6 +10841,18 @@
           <w:sz w:val="19"/>
         </w:rPr>
         <w:t>Gibbons, S. (2018). Using Prioritization Matrices to Inform UX Decisions. Nielsen Norman Group. https://www.nngroup.com/articles/prioritization-matrices/ (Rate each option on the same few criteria, such as value to the user against effort, and put the reason next to each rating.)</w:t>
+      </w:r>
+    </w:p>
+    <w:p>
+      <w:pPr>
+        <w:spacing w:before="0" w:after="80"/>
+        <w:ind w:left="283" w:hanging="283"/>
+      </w:pPr>
+      <w:r>
+        <w:rPr>
+          <w:sz w:val="19"/>
+        </w:rPr>
+        <w:t>Regulation (EU) 2024/1689 of the European Parliament and of the Council laying down harmonised rules on artificial intelligence (Artificial Intelligence Act). Official Journal of the European Union, 12 July 2024. (Among other duties, people must be informed when they interact with an AI system; check the current state of its application before a course run.)</w:t>
       </w:r>
     </w:p>
     <w:p>
@@ -8508,10 +10925,10 @@
         </w:tblCellMar>
       </w:tblPr>
       <w:tblGrid>
-        <w:gridCol w:w="2182"/>
-        <w:gridCol w:w="5277"/>
-        <w:gridCol w:w="1258"/>
-        <w:gridCol w:w="921"/>
+        <w:gridCol w:w="2127"/>
+        <w:gridCol w:w="5071"/>
+        <w:gridCol w:w="1529"/>
+        <w:gridCol w:w="911"/>
       </w:tblGrid>
       <w:tr>
         <w:trPr>
@@ -8520,7 +10937,7 @@
         </w:trPr>
         <w:tc>
           <w:tcPr>
-            <w:tcW w:type="dxa" w:w="2182"/>
+            <w:tcW w:type="dxa" w:w="2127"/>
             <w:shd w:val="clear" w:color="auto" w:fill="E6ECF4"/>
           </w:tcPr>
           <w:p>
@@ -8538,7 +10955,7 @@
         </w:tc>
         <w:tc>
           <w:tcPr>
-            <w:tcW w:type="dxa" w:w="5277"/>
+            <w:tcW w:type="dxa" w:w="5071"/>
             <w:shd w:val="clear" w:color="auto" w:fill="E6ECF4"/>
           </w:tcPr>
           <w:p>
@@ -8556,7 +10973,7 @@
         </w:tc>
         <w:tc>
           <w:tcPr>
-            <w:tcW w:type="dxa" w:w="1258"/>
+            <w:tcW w:type="dxa" w:w="1529"/>
             <w:shd w:val="clear" w:color="auto" w:fill="E6ECF4"/>
           </w:tcPr>
           <w:p>
@@ -8574,7 +10991,7 @@
         </w:tc>
         <w:tc>
           <w:tcPr>
-            <w:tcW w:type="dxa" w:w="921"/>
+            <w:tcW w:type="dxa" w:w="911"/>
             <w:shd w:val="clear" w:color="auto" w:fill="E6ECF4"/>
           </w:tcPr>
           <w:p>
@@ -8597,7 +11014,7 @@
         </w:trPr>
         <w:tc>
           <w:tcPr>
-            <w:tcW w:type="dxa" w:w="2182"/>
+            <w:tcW w:type="dxa" w:w="2127"/>
           </w:tcPr>
           <w:p>
             <w:pPr>
@@ -8614,7 +11031,7 @@
         </w:tc>
         <w:tc>
           <w:tcPr>
-            <w:tcW w:type="dxa" w:w="5277"/>
+            <w:tcW w:type="dxa" w:w="5071"/>
           </w:tcPr>
           <w:p>
             <w:pPr>
@@ -8630,7 +11047,7 @@
         </w:tc>
         <w:tc>
           <w:tcPr>
-            <w:tcW w:type="dxa" w:w="1258"/>
+            <w:tcW w:type="dxa" w:w="1529"/>
           </w:tcPr>
           <w:p>
             <w:pPr>
@@ -8646,7 +11063,7 @@
         </w:tc>
         <w:tc>
           <w:tcPr>
-            <w:tcW w:type="dxa" w:w="921"/>
+            <w:tcW w:type="dxa" w:w="911"/>
           </w:tcPr>
           <w:p>
             <w:pPr>
@@ -8667,7 +11084,7 @@
         </w:trPr>
         <w:tc>
           <w:tcPr>
-            <w:tcW w:type="dxa" w:w="2182"/>
+            <w:tcW w:type="dxa" w:w="2127"/>
           </w:tcPr>
           <w:p>
             <w:pPr>
@@ -8678,13 +11095,13 @@
                 <w:b/>
                 <w:sz w:val="19"/>
               </w:rPr>
-              <w:t>Case assumption</w:t>
-            </w:r>
-          </w:p>
-        </w:tc>
-        <w:tc>
-          <w:tcPr>
-            <w:tcW w:type="dxa" w:w="5277"/>
+              <w:t>Attention</w:t>
+            </w:r>
+          </w:p>
+        </w:tc>
+        <w:tc>
+          <w:tcPr>
+            <w:tcW w:type="dxa" w:w="5071"/>
           </w:tcPr>
           <w:p>
             <w:pPr>
@@ -8694,13 +11111,13 @@
               <w:rPr>
                 <w:sz w:val="19"/>
               </w:rPr>
-              <w:t>A fact made up for this exercise to fill a gap in the plan's case. It is marked so you know it is not part of the plan.</w:t>
-            </w:r>
-          </w:p>
-        </w:tc>
-        <w:tc>
-          <w:tcPr>
-            <w:tcW w:type="dxa" w:w="1258"/>
+              <w:t>The mind's spotlight. Only a small part of a screen is processed at any moment; attention decides which part.</w:t>
+            </w:r>
+          </w:p>
+        </w:tc>
+        <w:tc>
+          <w:tcPr>
+            <w:tcW w:type="dxa" w:w="1529"/>
           </w:tcPr>
           <w:p>
             <w:pPr>
@@ -8710,13 +11127,13 @@
               <w:rPr>
                 <w:sz w:val="19"/>
               </w:rPr>
-              <w:t>—</w:t>
-            </w:r>
-          </w:p>
-        </w:tc>
-        <w:tc>
-          <w:tcPr>
-            <w:tcW w:type="dxa" w:w="921"/>
+              <w:t>A flashing banner takes attention away from the form you were filling in.</w:t>
+            </w:r>
+          </w:p>
+        </w:tc>
+        <w:tc>
+          <w:tcPr>
+            <w:tcW w:type="dxa" w:w="911"/>
           </w:tcPr>
           <w:p>
             <w:pPr>
@@ -8737,7 +11154,7 @@
         </w:trPr>
         <w:tc>
           <w:tcPr>
-            <w:tcW w:type="dxa" w:w="2182"/>
+            <w:tcW w:type="dxa" w:w="2127"/>
           </w:tcPr>
           <w:p>
             <w:pPr>
@@ -8748,13 +11165,13 @@
                 <w:b/>
                 <w:sz w:val="19"/>
               </w:rPr>
-              <w:t>Chief Experience Officer</w:t>
-            </w:r>
-          </w:p>
-        </w:tc>
-        <w:tc>
-          <w:tcPr>
-            <w:tcW w:type="dxa" w:w="5277"/>
+              <w:t>Case assumption</w:t>
+            </w:r>
+          </w:p>
+        </w:tc>
+        <w:tc>
+          <w:tcPr>
+            <w:tcW w:type="dxa" w:w="5071"/>
           </w:tcPr>
           <w:p>
             <w:pPr>
@@ -8764,13 +11181,13 @@
               <w:rPr>
                 <w:sz w:val="19"/>
               </w:rPr>
-              <w:t>The manager who is responsible for the experience customers have across all channels, and who decides where the company invests in it.</w:t>
-            </w:r>
-          </w:p>
-        </w:tc>
-        <w:tc>
-          <w:tcPr>
-            <w:tcW w:type="dxa" w:w="1258"/>
+              <w:t>A fact made up for this exercise to fill a gap in the plan's case. It is marked so you know it is not part of the plan.</w:t>
+            </w:r>
+          </w:p>
+        </w:tc>
+        <w:tc>
+          <w:tcPr>
+            <w:tcW w:type="dxa" w:w="1529"/>
           </w:tcPr>
           <w:p>
             <w:pPr>
@@ -8786,7 +11203,7 @@
         </w:tc>
         <w:tc>
           <w:tcPr>
-            <w:tcW w:type="dxa" w:w="921"/>
+            <w:tcW w:type="dxa" w:w="911"/>
           </w:tcPr>
           <w:p>
             <w:pPr>
@@ -8807,7 +11224,7 @@
         </w:trPr>
         <w:tc>
           <w:tcPr>
-            <w:tcW w:type="dxa" w:w="2182"/>
+            <w:tcW w:type="dxa" w:w="2127"/>
           </w:tcPr>
           <w:p>
             <w:pPr>
@@ -8818,13 +11235,13 @@
                 <w:b/>
                 <w:sz w:val="19"/>
               </w:rPr>
-              <w:t>Dialogue logic</w:t>
-            </w:r>
-          </w:p>
-        </w:tc>
-        <w:tc>
-          <w:tcPr>
-            <w:tcW w:type="dxa" w:w="5277"/>
+              <w:t>Chief Experience Officer</w:t>
+            </w:r>
+          </w:p>
+        </w:tc>
+        <w:tc>
+          <w:tcPr>
+            <w:tcW w:type="dxa" w:w="5071"/>
           </w:tcPr>
           <w:p>
             <w:pPr>
@@ -8834,13 +11251,13 @@
               <w:rPr>
                 <w:sz w:val="19"/>
               </w:rPr>
-              <w:t>The order of turns in a voice conversation: who speaks when, one question at a time, and what happens after each answer.</w:t>
-            </w:r>
-          </w:p>
-        </w:tc>
-        <w:tc>
-          <w:tcPr>
-            <w:tcW w:type="dxa" w:w="1258"/>
+              <w:t>The manager who is responsible for the experience customers have across all channels, and who decides where the company invests in it.</w:t>
+            </w:r>
+          </w:p>
+        </w:tc>
+        <w:tc>
+          <w:tcPr>
+            <w:tcW w:type="dxa" w:w="1529"/>
           </w:tcPr>
           <w:p>
             <w:pPr>
@@ -8856,7 +11273,7 @@
         </w:tc>
         <w:tc>
           <w:tcPr>
-            <w:tcW w:type="dxa" w:w="921"/>
+            <w:tcW w:type="dxa" w:w="911"/>
           </w:tcPr>
           <w:p>
             <w:pPr>
@@ -8866,7 +11283,7 @@
               <w:rPr>
                 <w:sz w:val="19"/>
               </w:rPr>
-              <w:t>Day 11</w:t>
+              <w:t>Day 1</w:t>
             </w:r>
           </w:p>
         </w:tc>
@@ -8877,7 +11294,7 @@
         </w:trPr>
         <w:tc>
           <w:tcPr>
-            <w:tcW w:type="dxa" w:w="2182"/>
+            <w:tcW w:type="dxa" w:w="2127"/>
           </w:tcPr>
           <w:p>
             <w:pPr>
@@ -8888,13 +11305,13 @@
                 <w:b/>
                 <w:sz w:val="19"/>
               </w:rPr>
-              <w:t>Error handling</w:t>
-            </w:r>
-          </w:p>
-        </w:tc>
-        <w:tc>
-          <w:tcPr>
-            <w:tcW w:type="dxa" w:w="5277"/>
+              <w:t>Chunk</w:t>
+            </w:r>
+          </w:p>
+        </w:tc>
+        <w:tc>
+          <w:tcPr>
+            <w:tcW w:type="dxa" w:w="5071"/>
           </w:tcPr>
           <w:p>
             <w:pPr>
@@ -8904,13 +11321,13 @@
               <w:rPr>
                 <w:sz w:val="19"/>
               </w:rPr>
-              <w:t>What an assistant does when it does not understand: a good one asks a better question or hands over to a person instead of repeating itself.</w:t>
-            </w:r>
-          </w:p>
-        </w:tc>
-        <w:tc>
-          <w:tcPr>
-            <w:tcW w:type="dxa" w:w="1258"/>
+              <w:t>A group of items the memory treats as one, such as a phone number split into blocks. Grouping information into chunks makes it easier to hold.</w:t>
+            </w:r>
+          </w:p>
+        </w:tc>
+        <w:tc>
+          <w:tcPr>
+            <w:tcW w:type="dxa" w:w="1529"/>
           </w:tcPr>
           <w:p>
             <w:pPr>
@@ -8926,7 +11343,7 @@
         </w:tc>
         <w:tc>
           <w:tcPr>
-            <w:tcW w:type="dxa" w:w="921"/>
+            <w:tcW w:type="dxa" w:w="911"/>
           </w:tcPr>
           <w:p>
             <w:pPr>
@@ -8936,7 +11353,7 @@
               <w:rPr>
                 <w:sz w:val="19"/>
               </w:rPr>
-              <w:t>Day 11</w:t>
+              <w:t>Day 4</w:t>
             </w:r>
           </w:p>
         </w:tc>
@@ -8947,7 +11364,7 @@
         </w:trPr>
         <w:tc>
           <w:tcPr>
-            <w:tcW w:type="dxa" w:w="2182"/>
+            <w:tcW w:type="dxa" w:w="2127"/>
           </w:tcPr>
           <w:p>
             <w:pPr>
@@ -8958,13 +11375,13 @@
                 <w:b/>
                 <w:sz w:val="19"/>
               </w:rPr>
-              <w:t>Functional, interaction and test prototype</w:t>
-            </w:r>
-          </w:p>
-        </w:tc>
-        <w:tc>
-          <w:tcPr>
-            <w:tcW w:type="dxa" w:w="5277"/>
+              <w:t>Dialogue logic</w:t>
+            </w:r>
+          </w:p>
+        </w:tc>
+        <w:tc>
+          <w:tcPr>
+            <w:tcW w:type="dxa" w:w="5071"/>
           </w:tcPr>
           <w:p>
             <w:pPr>
@@ -8974,13 +11391,13 @@
               <w:rPr>
                 <w:sz w:val="19"/>
               </w:rPr>
-              <w:t>Three kinds of prototype: one checks whether the technology works, one how the dialogue feels, one how real users manage real tasks.</w:t>
-            </w:r>
-          </w:p>
-        </w:tc>
-        <w:tc>
-          <w:tcPr>
-            <w:tcW w:type="dxa" w:w="1258"/>
+              <w:t>The order of turns in a voice conversation: who speaks when, one question at a time, and what happens after each answer.</w:t>
+            </w:r>
+          </w:p>
+        </w:tc>
+        <w:tc>
+          <w:tcPr>
+            <w:tcW w:type="dxa" w:w="1529"/>
           </w:tcPr>
           <w:p>
             <w:pPr>
@@ -8996,7 +11413,7 @@
         </w:tc>
         <w:tc>
           <w:tcPr>
-            <w:tcW w:type="dxa" w:w="921"/>
+            <w:tcW w:type="dxa" w:w="911"/>
           </w:tcPr>
           <w:p>
             <w:pPr>
@@ -9017,7 +11434,7 @@
         </w:trPr>
         <w:tc>
           <w:tcPr>
-            <w:tcW w:type="dxa" w:w="2182"/>
+            <w:tcW w:type="dxa" w:w="2127"/>
           </w:tcPr>
           <w:p>
             <w:pPr>
@@ -9028,13 +11445,13 @@
                 <w:b/>
                 <w:sz w:val="19"/>
               </w:rPr>
-              <w:t>Governance</w:t>
-            </w:r>
-          </w:p>
-        </w:tc>
-        <w:tc>
-          <w:tcPr>
-            <w:tcW w:type="dxa" w:w="5277"/>
+              <w:t>Error handling</w:t>
+            </w:r>
+          </w:p>
+        </w:tc>
+        <w:tc>
+          <w:tcPr>
+            <w:tcW w:type="dxa" w:w="5071"/>
           </w:tcPr>
           <w:p>
             <w:pPr>
@@ -9044,13 +11461,13 @@
               <w:rPr>
                 <w:sz w:val="19"/>
               </w:rPr>
-              <w:t>The rules about who may decide what, who is answerable for it and how disagreements are settled.</w:t>
-            </w:r>
-          </w:p>
-        </w:tc>
-        <w:tc>
-          <w:tcPr>
-            <w:tcW w:type="dxa" w:w="1258"/>
+              <w:t>What an assistant does when it does not understand: a good one asks a better question or hands over to a person instead of repeating itself.</w:t>
+            </w:r>
+          </w:p>
+        </w:tc>
+        <w:tc>
+          <w:tcPr>
+            <w:tcW w:type="dxa" w:w="1529"/>
           </w:tcPr>
           <w:p>
             <w:pPr>
@@ -9066,7 +11483,7 @@
         </w:tc>
         <w:tc>
           <w:tcPr>
-            <w:tcW w:type="dxa" w:w="921"/>
+            <w:tcW w:type="dxa" w:w="911"/>
           </w:tcPr>
           <w:p>
             <w:pPr>
@@ -9076,7 +11493,7 @@
               <w:rPr>
                 <w:sz w:val="19"/>
               </w:rPr>
-              <w:t>Day 1</w:t>
+              <w:t>Day 11</w:t>
             </w:r>
           </w:p>
         </w:tc>
@@ -9087,7 +11504,7 @@
         </w:trPr>
         <w:tc>
           <w:tcPr>
-            <w:tcW w:type="dxa" w:w="2182"/>
+            <w:tcW w:type="dxa" w:w="2127"/>
           </w:tcPr>
           <w:p>
             <w:pPr>
@@ -9098,13 +11515,13 @@
                 <w:b/>
                 <w:sz w:val="19"/>
               </w:rPr>
-              <w:t>Intelligent interface</w:t>
-            </w:r>
-          </w:p>
-        </w:tc>
-        <w:tc>
-          <w:tcPr>
-            <w:tcW w:type="dxa" w:w="5277"/>
+              <w:t>Functional, interaction and test prototype</w:t>
+            </w:r>
+          </w:p>
+        </w:tc>
+        <w:tc>
+          <w:tcPr>
+            <w:tcW w:type="dxa" w:w="5071"/>
           </w:tcPr>
           <w:p>
             <w:pPr>
@@ -9114,13 +11531,13 @@
               <w:rPr>
                 <w:sz w:val="19"/>
               </w:rPr>
-              <w:t>An interface that supports people in a way that fits their situation: it suggests, adapts or helps, instead of only doing the same thing for everyone.</w:t>
-            </w:r>
-          </w:p>
-        </w:tc>
-        <w:tc>
-          <w:tcPr>
-            <w:tcW w:type="dxa" w:w="1258"/>
+              <w:t>Three kinds of prototype: one checks whether the technology works, one how the dialogue feels, one how real users manage real tasks.</w:t>
+            </w:r>
+          </w:p>
+        </w:tc>
+        <w:tc>
+          <w:tcPr>
+            <w:tcW w:type="dxa" w:w="1529"/>
           </w:tcPr>
           <w:p>
             <w:pPr>
@@ -9136,7 +11553,7 @@
         </w:tc>
         <w:tc>
           <w:tcPr>
-            <w:tcW w:type="dxa" w:w="921"/>
+            <w:tcW w:type="dxa" w:w="911"/>
           </w:tcPr>
           <w:p>
             <w:pPr>
@@ -9146,7 +11563,7 @@
               <w:rPr>
                 <w:sz w:val="19"/>
               </w:rPr>
-              <w:t>Day 10</w:t>
+              <w:t>Day 11</w:t>
             </w:r>
           </w:p>
         </w:tc>
@@ -9157,7 +11574,7 @@
         </w:trPr>
         <w:tc>
           <w:tcPr>
-            <w:tcW w:type="dxa" w:w="2182"/>
+            <w:tcW w:type="dxa" w:w="2127"/>
           </w:tcPr>
           <w:p>
             <w:pPr>
@@ -9168,13 +11585,13 @@
                 <w:b/>
                 <w:sz w:val="19"/>
               </w:rPr>
-              <w:t>Mental model</w:t>
-            </w:r>
-          </w:p>
-        </w:tc>
-        <w:tc>
-          <w:tcPr>
-            <w:tcW w:type="dxa" w:w="5277"/>
+              <w:t>Governance</w:t>
+            </w:r>
+          </w:p>
+        </w:tc>
+        <w:tc>
+          <w:tcPr>
+            <w:tcW w:type="dxa" w:w="5071"/>
           </w:tcPr>
           <w:p>
             <w:pPr>
@@ -9184,13 +11601,13 @@
               <w:rPr>
                 <w:sz w:val="19"/>
               </w:rPr>
-              <w:t>What a person believes a product is and how it works. A design feels natural when it fits that belief and confusing when it does not.</w:t>
-            </w:r>
-          </w:p>
-        </w:tc>
-        <w:tc>
-          <w:tcPr>
-            <w:tcW w:type="dxa" w:w="1258"/>
+              <w:t>The rules about who may decide what, who is answerable for it and how disagreements are settled.</w:t>
+            </w:r>
+          </w:p>
+        </w:tc>
+        <w:tc>
+          <w:tcPr>
+            <w:tcW w:type="dxa" w:w="1529"/>
           </w:tcPr>
           <w:p>
             <w:pPr>
@@ -9200,13 +11617,13 @@
               <w:rPr>
                 <w:sz w:val="19"/>
               </w:rPr>
-              <w:t>Most people expect a basket icon to show what they have chosen so far.</w:t>
-            </w:r>
-          </w:p>
-        </w:tc>
-        <w:tc>
-          <w:tcPr>
-            <w:tcW w:type="dxa" w:w="921"/>
+              <w:t>—</w:t>
+            </w:r>
+          </w:p>
+        </w:tc>
+        <w:tc>
+          <w:tcPr>
+            <w:tcW w:type="dxa" w:w="911"/>
           </w:tcPr>
           <w:p>
             <w:pPr>
@@ -9227,7 +11644,7 @@
         </w:trPr>
         <w:tc>
           <w:tcPr>
-            <w:tcW w:type="dxa" w:w="2182"/>
+            <w:tcW w:type="dxa" w:w="2127"/>
           </w:tcPr>
           <w:p>
             <w:pPr>
@@ -9238,13 +11655,13 @@
                 <w:b/>
                 <w:sz w:val="19"/>
               </w:rPr>
-              <w:t>Neuro-UX</w:t>
-            </w:r>
-          </w:p>
-        </w:tc>
-        <w:tc>
-          <w:tcPr>
-            <w:tcW w:type="dxa" w:w="5277"/>
+              <w:t>Intelligent interface</w:t>
+            </w:r>
+          </w:p>
+        </w:tc>
+        <w:tc>
+          <w:tcPr>
+            <w:tcW w:type="dxa" w:w="5071"/>
           </w:tcPr>
           <w:p>
             <w:pPr>
@@ -9254,13 +11671,13 @@
               <w:rPr>
                 <w:sz w:val="19"/>
               </w:rPr>
-              <w:t>Designing an interface with knowledge of how the brain sees, attends, feels and decides, so that the design steers these processes on purpose and responsibly.</w:t>
-            </w:r>
-          </w:p>
-        </w:tc>
-        <w:tc>
-          <w:tcPr>
-            <w:tcW w:type="dxa" w:w="1258"/>
+              <w:t>An interface that supports people in a way that fits their situation: it suggests, adapts or helps, instead of only doing the same thing for everyone.</w:t>
+            </w:r>
+          </w:p>
+        </w:tc>
+        <w:tc>
+          <w:tcPr>
+            <w:tcW w:type="dxa" w:w="1529"/>
           </w:tcPr>
           <w:p>
             <w:pPr>
@@ -9276,7 +11693,7 @@
         </w:tc>
         <w:tc>
           <w:tcPr>
-            <w:tcW w:type="dxa" w:w="921"/>
+            <w:tcW w:type="dxa" w:w="911"/>
           </w:tcPr>
           <w:p>
             <w:pPr>
@@ -9286,7 +11703,7 @@
               <w:rPr>
                 <w:sz w:val="19"/>
               </w:rPr>
-              <w:t>Day 1</w:t>
+              <w:t>Day 10</w:t>
             </w:r>
           </w:p>
         </w:tc>
@@ -9297,7 +11714,7 @@
         </w:trPr>
         <w:tc>
           <w:tcPr>
-            <w:tcW w:type="dxa" w:w="2182"/>
+            <w:tcW w:type="dxa" w:w="2127"/>
           </w:tcPr>
           <w:p>
             <w:pPr>
@@ -9308,13 +11725,13 @@
                 <w:b/>
                 <w:sz w:val="19"/>
               </w:rPr>
-              <w:t>Predictability</w:t>
-            </w:r>
-          </w:p>
-        </w:tc>
-        <w:tc>
-          <w:tcPr>
-            <w:tcW w:type="dxa" w:w="5277"/>
+              <w:t>Mental model</w:t>
+            </w:r>
+          </w:p>
+        </w:tc>
+        <w:tc>
+          <w:tcPr>
+            <w:tcW w:type="dxa" w:w="5071"/>
           </w:tcPr>
           <w:p>
             <w:pPr>
@@ -9324,13 +11741,13 @@
               <w:rPr>
                 <w:sz w:val="19"/>
               </w:rPr>
-              <w:t>Being able to tell in advance how something will work, because it works like what you have seen before.</w:t>
-            </w:r>
-          </w:p>
-        </w:tc>
-        <w:tc>
-          <w:tcPr>
-            <w:tcW w:type="dxa" w:w="1258"/>
+              <w:t>What a person believes a product is and how it works. A design feels natural when it fits that belief and confusing when it does not.</w:t>
+            </w:r>
+          </w:p>
+        </w:tc>
+        <w:tc>
+          <w:tcPr>
+            <w:tcW w:type="dxa" w:w="1529"/>
           </w:tcPr>
           <w:p>
             <w:pPr>
@@ -9340,13 +11757,13 @@
               <w:rPr>
                 <w:sz w:val="19"/>
               </w:rPr>
-              <w:t>—</w:t>
-            </w:r>
-          </w:p>
-        </w:tc>
-        <w:tc>
-          <w:tcPr>
-            <w:tcW w:type="dxa" w:w="921"/>
+              <w:t>Most people expect a basket icon to show what they have chosen so far.</w:t>
+            </w:r>
+          </w:p>
+        </w:tc>
+        <w:tc>
+          <w:tcPr>
+            <w:tcW w:type="dxa" w:w="911"/>
           </w:tcPr>
           <w:p>
             <w:pPr>
@@ -9356,7 +11773,7 @@
               <w:rPr>
                 <w:sz w:val="19"/>
               </w:rPr>
-              <w:t>Day 6</w:t>
+              <w:t>Day 1</w:t>
             </w:r>
           </w:p>
         </w:tc>
@@ -9367,7 +11784,7 @@
         </w:trPr>
         <w:tc>
           <w:tcPr>
-            <w:tcW w:type="dxa" w:w="2182"/>
+            <w:tcW w:type="dxa" w:w="2127"/>
           </w:tcPr>
           <w:p>
             <w:pPr>
@@ -9378,13 +11795,13 @@
                 <w:b/>
                 <w:sz w:val="19"/>
               </w:rPr>
-              <w:t>Stimulus reduction</w:t>
-            </w:r>
-          </w:p>
-        </w:tc>
-        <w:tc>
-          <w:tcPr>
-            <w:tcW w:type="dxa" w:w="5277"/>
+              <w:t>Neuro-UX</w:t>
+            </w:r>
+          </w:p>
+        </w:tc>
+        <w:tc>
+          <w:tcPr>
+            <w:tcW w:type="dxa" w:w="5071"/>
           </w:tcPr>
           <w:p>
             <w:pPr>
@@ -9394,13 +11811,13 @@
               <w:rPr>
                 <w:sz w:val="19"/>
               </w:rPr>
-              <w:t>Showing or saying fewer things at once, so the mind can attend to what matters.</w:t>
-            </w:r>
-          </w:p>
-        </w:tc>
-        <w:tc>
-          <w:tcPr>
-            <w:tcW w:type="dxa" w:w="1258"/>
+              <w:t>Designing an interface with knowledge of how the brain sees, attends, feels and decides, so that the design steers these processes on purpose and responsibly.</w:t>
+            </w:r>
+          </w:p>
+        </w:tc>
+        <w:tc>
+          <w:tcPr>
+            <w:tcW w:type="dxa" w:w="1529"/>
           </w:tcPr>
           <w:p>
             <w:pPr>
@@ -9416,7 +11833,7 @@
         </w:tc>
         <w:tc>
           <w:tcPr>
-            <w:tcW w:type="dxa" w:w="921"/>
+            <w:tcW w:type="dxa" w:w="911"/>
           </w:tcPr>
           <w:p>
             <w:pPr>
@@ -9426,7 +11843,7 @@
               <w:rPr>
                 <w:sz w:val="19"/>
               </w:rPr>
-              <w:t>Day 11</w:t>
+              <w:t>Day 1</w:t>
             </w:r>
           </w:p>
         </w:tc>
@@ -9437,7 +11854,7 @@
         </w:trPr>
         <w:tc>
           <w:tcPr>
-            <w:tcW w:type="dxa" w:w="2182"/>
+            <w:tcW w:type="dxa" w:w="2127"/>
           </w:tcPr>
           <w:p>
             <w:pPr>
@@ -9448,13 +11865,13 @@
                 <w:b/>
                 <w:sz w:val="19"/>
               </w:rPr>
-              <w:t>Touchpoint</w:t>
-            </w:r>
-          </w:p>
-        </w:tc>
-        <w:tc>
-          <w:tcPr>
-            <w:tcW w:type="dxa" w:w="5277"/>
+              <w:t>Predictability</w:t>
+            </w:r>
+          </w:p>
+        </w:tc>
+        <w:tc>
+          <w:tcPr>
+            <w:tcW w:type="dxa" w:w="5071"/>
           </w:tcPr>
           <w:p>
             <w:pPr>
@@ -9464,13 +11881,13 @@
               <w:rPr>
                 <w:sz w:val="19"/>
               </w:rPr>
-              <w:t>Any place where a person meets the company: the website, the customer portal, the app, a chatbot or a phone call.</w:t>
-            </w:r>
-          </w:p>
-        </w:tc>
-        <w:tc>
-          <w:tcPr>
-            <w:tcW w:type="dxa" w:w="1258"/>
+              <w:t>Being able to tell in advance how something will work, because it works like what you have seen before.</w:t>
+            </w:r>
+          </w:p>
+        </w:tc>
+        <w:tc>
+          <w:tcPr>
+            <w:tcW w:type="dxa" w:w="1529"/>
           </w:tcPr>
           <w:p>
             <w:pPr>
@@ -9486,7 +11903,7 @@
         </w:tc>
         <w:tc>
           <w:tcPr>
-            <w:tcW w:type="dxa" w:w="921"/>
+            <w:tcW w:type="dxa" w:w="911"/>
           </w:tcPr>
           <w:p>
             <w:pPr>
@@ -9496,7 +11913,7 @@
               <w:rPr>
                 <w:sz w:val="19"/>
               </w:rPr>
-              <w:t>Day 1</w:t>
+              <w:t>Day 6</w:t>
             </w:r>
           </w:p>
         </w:tc>
@@ -9507,7 +11924,7 @@
         </w:trPr>
         <w:tc>
           <w:tcPr>
-            <w:tcW w:type="dxa" w:w="2182"/>
+            <w:tcW w:type="dxa" w:w="2127"/>
           </w:tcPr>
           <w:p>
             <w:pPr>
@@ -9518,13 +11935,13 @@
                 <w:b/>
                 <w:sz w:val="19"/>
               </w:rPr>
-              <w:t>UX (user experience)</w:t>
-            </w:r>
-          </w:p>
-        </w:tc>
-        <w:tc>
-          <w:tcPr>
-            <w:tcW w:type="dxa" w:w="5277"/>
+              <w:t>Stimulus reduction</w:t>
+            </w:r>
+          </w:p>
+        </w:tc>
+        <w:tc>
+          <w:tcPr>
+            <w:tcW w:type="dxa" w:w="5071"/>
           </w:tcPr>
           <w:p>
             <w:pPr>
@@ -9534,13 +11951,13 @@
               <w:rPr>
                 <w:sz w:val="19"/>
               </w:rPr>
-              <w:t>Everything a person goes through when using a product: what they notice, understand, feel and do, from the first look to the last step. The screens are only one part of it.</w:t>
-            </w:r>
-          </w:p>
-        </w:tc>
-        <w:tc>
-          <w:tcPr>
-            <w:tcW w:type="dxa" w:w="1258"/>
+              <w:t>Showing or saying fewer things at once, so the mind can attend to what matters.</w:t>
+            </w:r>
+          </w:p>
+        </w:tc>
+        <w:tc>
+          <w:tcPr>
+            <w:tcW w:type="dxa" w:w="1529"/>
           </w:tcPr>
           <w:p>
             <w:pPr>
@@ -9550,13 +11967,13 @@
               <w:rPr>
                 <w:sz w:val="19"/>
               </w:rPr>
-              <w:t>Finding the booking you want at once and feeling sure it went through is a good UX.</w:t>
-            </w:r>
-          </w:p>
-        </w:tc>
-        <w:tc>
-          <w:tcPr>
-            <w:tcW w:type="dxa" w:w="921"/>
+              <w:t>—</w:t>
+            </w:r>
+          </w:p>
+        </w:tc>
+        <w:tc>
+          <w:tcPr>
+            <w:tcW w:type="dxa" w:w="911"/>
           </w:tcPr>
           <w:p>
             <w:pPr>
@@ -9566,7 +11983,7 @@
               <w:rPr>
                 <w:sz w:val="19"/>
               </w:rPr>
-              <w:t>Day 1</w:t>
+              <w:t>Day 11</w:t>
             </w:r>
           </w:p>
         </w:tc>
@@ -9577,7 +11994,7 @@
         </w:trPr>
         <w:tc>
           <w:tcPr>
-            <w:tcW w:type="dxa" w:w="2182"/>
+            <w:tcW w:type="dxa" w:w="2127"/>
           </w:tcPr>
           <w:p>
             <w:pPr>
@@ -9588,13 +12005,13 @@
                 <w:b/>
                 <w:sz w:val="19"/>
               </w:rPr>
-              <w:t>Voice user interface</w:t>
-            </w:r>
-          </w:p>
-        </w:tc>
-        <w:tc>
-          <w:tcPr>
-            <w:tcW w:type="dxa" w:w="5277"/>
+              <w:t>Touchpoint</w:t>
+            </w:r>
+          </w:p>
+        </w:tc>
+        <w:tc>
+          <w:tcPr>
+            <w:tcW w:type="dxa" w:w="5071"/>
           </w:tcPr>
           <w:p>
             <w:pPr>
@@ -9604,13 +12021,13 @@
               <w:rPr>
                 <w:sz w:val="19"/>
               </w:rPr>
-              <w:t>An interface people use by speaking and listening; it has no screen to show what it understood, so it has to say it back.</w:t>
-            </w:r>
-          </w:p>
-        </w:tc>
-        <w:tc>
-          <w:tcPr>
-            <w:tcW w:type="dxa" w:w="1258"/>
+              <w:t>Any place where a person meets the company: the website, the customer portal, the app, a chatbot or a phone call.</w:t>
+            </w:r>
+          </w:p>
+        </w:tc>
+        <w:tc>
+          <w:tcPr>
+            <w:tcW w:type="dxa" w:w="1529"/>
           </w:tcPr>
           <w:p>
             <w:pPr>
@@ -9626,7 +12043,7 @@
         </w:tc>
         <w:tc>
           <w:tcPr>
-            <w:tcW w:type="dxa" w:w="921"/>
+            <w:tcW w:type="dxa" w:w="911"/>
           </w:tcPr>
           <w:p>
             <w:pPr>
@@ -9636,7 +12053,7 @@
               <w:rPr>
                 <w:sz w:val="19"/>
               </w:rPr>
-              <w:t>Day 10</w:t>
+              <w:t>Day 1</w:t>
             </w:r>
           </w:p>
         </w:tc>
@@ -9647,7 +12064,7 @@
         </w:trPr>
         <w:tc>
           <w:tcPr>
-            <w:tcW w:type="dxa" w:w="2182"/>
+            <w:tcW w:type="dxa" w:w="2127"/>
           </w:tcPr>
           <w:p>
             <w:pPr>
@@ -9658,13 +12075,13 @@
                 <w:b/>
                 <w:sz w:val="19"/>
               </w:rPr>
-              <w:t>Wizard of Oz</w:t>
-            </w:r>
-          </w:p>
-        </w:tc>
-        <w:tc>
-          <w:tcPr>
-            <w:tcW w:type="dxa" w:w="5277"/>
+              <w:t>UX (user experience)</w:t>
+            </w:r>
+          </w:p>
+        </w:tc>
+        <w:tc>
+          <w:tcPr>
+            <w:tcW w:type="dxa" w:w="5071"/>
           </w:tcPr>
           <w:p>
             <w:pPr>
@@ -9674,13 +12091,13 @@
               <w:rPr>
                 <w:sz w:val="19"/>
               </w:rPr>
-              <w:t>A test where a person secretly plays the system, so a dialogue can be tried before it is built.</w:t>
-            </w:r>
-          </w:p>
-        </w:tc>
-        <w:tc>
-          <w:tcPr>
-            <w:tcW w:type="dxa" w:w="1258"/>
+              <w:t>Everything a person goes through when using a product: what they notice, understand, feel and do, from the first look to the last step. The screens are only one part of it.</w:t>
+            </w:r>
+          </w:p>
+        </w:tc>
+        <w:tc>
+          <w:tcPr>
+            <w:tcW w:type="dxa" w:w="1529"/>
           </w:tcPr>
           <w:p>
             <w:pPr>
@@ -9690,13 +12107,13 @@
               <w:rPr>
                 <w:sz w:val="19"/>
               </w:rPr>
-              <w:t>—</w:t>
-            </w:r>
-          </w:p>
-        </w:tc>
-        <w:tc>
-          <w:tcPr>
-            <w:tcW w:type="dxa" w:w="921"/>
+              <w:t>Finding the booking you want at once and feeling sure it went through is a good UX.</w:t>
+            </w:r>
+          </w:p>
+        </w:tc>
+        <w:tc>
+          <w:tcPr>
+            <w:tcW w:type="dxa" w:w="911"/>
           </w:tcPr>
           <w:p>
             <w:pPr>
@@ -9706,7 +12123,7 @@
               <w:rPr>
                 <w:sz w:val="19"/>
               </w:rPr>
-              <w:t>Day 11</w:t>
+              <w:t>Day 1</w:t>
             </w:r>
           </w:p>
         </w:tc>
@@ -9717,7 +12134,7 @@
         </w:trPr>
         <w:tc>
           <w:tcPr>
-            <w:tcW w:type="dxa" w:w="2182"/>
+            <w:tcW w:type="dxa" w:w="2127"/>
           </w:tcPr>
           <w:p>
             <w:pPr>
@@ -9728,13 +12145,153 @@
                 <w:b/>
                 <w:sz w:val="19"/>
               </w:rPr>
+              <w:t>Voice user interface</w:t>
+            </w:r>
+          </w:p>
+        </w:tc>
+        <w:tc>
+          <w:tcPr>
+            <w:tcW w:type="dxa" w:w="5071"/>
+          </w:tcPr>
+          <w:p>
+            <w:pPr>
+              <w:spacing w:before="0" w:after="0"/>
+            </w:pPr>
+            <w:r>
+              <w:rPr>
+                <w:sz w:val="19"/>
+              </w:rPr>
+              <w:t>An interface people use by speaking and listening; it has no screen to show what it understood, so it has to say it back.</w:t>
+            </w:r>
+          </w:p>
+        </w:tc>
+        <w:tc>
+          <w:tcPr>
+            <w:tcW w:type="dxa" w:w="1529"/>
+          </w:tcPr>
+          <w:p>
+            <w:pPr>
+              <w:spacing w:before="0" w:after="0"/>
+            </w:pPr>
+            <w:r>
+              <w:rPr>
+                <w:sz w:val="19"/>
+              </w:rPr>
+              <w:t>—</w:t>
+            </w:r>
+          </w:p>
+        </w:tc>
+        <w:tc>
+          <w:tcPr>
+            <w:tcW w:type="dxa" w:w="911"/>
+          </w:tcPr>
+          <w:p>
+            <w:pPr>
+              <w:spacing w:before="0" w:after="0"/>
+            </w:pPr>
+            <w:r>
+              <w:rPr>
+                <w:sz w:val="19"/>
+              </w:rPr>
+              <w:t>Day 10</w:t>
+            </w:r>
+          </w:p>
+        </w:tc>
+      </w:tr>
+      <w:tr>
+        <w:trPr>
+          <w:cantSplit/>
+        </w:trPr>
+        <w:tc>
+          <w:tcPr>
+            <w:tcW w:type="dxa" w:w="2127"/>
+          </w:tcPr>
+          <w:p>
+            <w:pPr>
+              <w:spacing w:before="0" w:after="0"/>
+            </w:pPr>
+            <w:r>
+              <w:rPr>
+                <w:b/>
+                <w:sz w:val="19"/>
+              </w:rPr>
+              <w:t>Wizard of Oz</w:t>
+            </w:r>
+          </w:p>
+        </w:tc>
+        <w:tc>
+          <w:tcPr>
+            <w:tcW w:type="dxa" w:w="5071"/>
+          </w:tcPr>
+          <w:p>
+            <w:pPr>
+              <w:spacing w:before="0" w:after="0"/>
+            </w:pPr>
+            <w:r>
+              <w:rPr>
+                <w:sz w:val="19"/>
+              </w:rPr>
+              <w:t>A test where a person secretly plays the system, so a dialogue can be tried before it is built.</w:t>
+            </w:r>
+          </w:p>
+        </w:tc>
+        <w:tc>
+          <w:tcPr>
+            <w:tcW w:type="dxa" w:w="1529"/>
+          </w:tcPr>
+          <w:p>
+            <w:pPr>
+              <w:spacing w:before="0" w:after="0"/>
+            </w:pPr>
+            <w:r>
+              <w:rPr>
+                <w:sz w:val="19"/>
+              </w:rPr>
+              <w:t>—</w:t>
+            </w:r>
+          </w:p>
+        </w:tc>
+        <w:tc>
+          <w:tcPr>
+            <w:tcW w:type="dxa" w:w="911"/>
+          </w:tcPr>
+          <w:p>
+            <w:pPr>
+              <w:spacing w:before="0" w:after="0"/>
+            </w:pPr>
+            <w:r>
+              <w:rPr>
+                <w:sz w:val="19"/>
+              </w:rPr>
+              <w:t>Day 11</w:t>
+            </w:r>
+          </w:p>
+        </w:tc>
+      </w:tr>
+      <w:tr>
+        <w:trPr>
+          <w:cantSplit/>
+        </w:trPr>
+        <w:tc>
+          <w:tcPr>
+            <w:tcW w:type="dxa" w:w="2127"/>
+          </w:tcPr>
+          <w:p>
+            <w:pPr>
+              <w:spacing w:before="0" w:after="0"/>
+            </w:pPr>
+            <w:r>
+              <w:rPr>
+                <w:b/>
+                <w:sz w:val="19"/>
+              </w:rPr>
               <w:t>Working memory</w:t>
             </w:r>
           </w:p>
         </w:tc>
         <w:tc>
           <w:tcPr>
-            <w:tcW w:type="dxa" w:w="5277"/>
+            <w:tcW w:type="dxa" w:w="5071"/>
           </w:tcPr>
           <w:p>
             <w:pPr>
@@ -9750,7 +12307,7 @@
         </w:tc>
         <w:tc>
           <w:tcPr>
-            <w:tcW w:type="dxa" w:w="1258"/>
+            <w:tcW w:type="dxa" w:w="1529"/>
           </w:tcPr>
           <w:p>
             <w:pPr>
@@ -9766,7 +12323,7 @@
         </w:tc>
         <w:tc>
           <w:tcPr>
-            <w:tcW w:type="dxa" w:w="921"/>
+            <w:tcW w:type="dxa" w:w="911"/>
           </w:tcPr>
           <w:p>
             <w:pPr>

</xml_diff>